<commit_message>
Align the Small Grant JeS pack to UKRI PL/PcL titles and the 17 Sep EC review.
Co-authored-by: Cursor <cursoragent@cursor.com>
</commit_message>
<xml_diff>
--- a/08_current/grant/live/01_Summary.docx
+++ b/08_current/grant/live/01_Summary.docx
@@ -1,214 +1,246 @@
 
 <file path=word/document.xml><?xml version="1.0" encoding="utf-8"?>
-<w:document xmlns:w="http://schemas.openxmlformats.org/wordprocessingml/2006/main" xmlns:m="http://schemas.openxmlformats.org/officeDocument/2006/math" xmlns:r="http://schemas.openxmlformats.org/officeDocument/2006/relationships" xmlns:o="urn:schemas-microsoft-com:office:office" xmlns:v="urn:schemas-microsoft-com:vml" xmlns:w10="urn:schemas-microsoft-com:office:word" xmlns:a="http://schemas.openxmlformats.org/drawingml/2006/main" xmlns:pic="http://schemas.openxmlformats.org/drawingml/2006/picture" xmlns:wp="http://schemas.openxmlformats.org/drawingml/2006/wordprocessingDrawing">
+<w:document xmlns:wpc="http://schemas.microsoft.com/office/word/2010/wordprocessingCanvas" xmlns:cx="http://schemas.microsoft.com/office/drawing/2014/chartex" xmlns:cx1="http://schemas.microsoft.com/office/drawing/2015/9/8/chartex" xmlns:cx2="http://schemas.microsoft.com/office/drawing/2015/10/21/chartex" xmlns:cx3="http://schemas.microsoft.com/office/drawing/2016/5/9/chartex" xmlns:cx4="http://schemas.microsoft.com/office/drawing/2016/5/10/chartex" xmlns:cx5="http://schemas.microsoft.com/office/drawing/2016/5/11/chartex" xmlns:cx6="http://schemas.microsoft.com/office/drawing/2016/5/12/chartex" xmlns:cx7="http://schemas.microsoft.com/office/drawing/2016/5/13/chartex" xmlns:cx8="http://schemas.microsoft.com/office/drawing/2016/5/14/chartex" xmlns:mc="http://schemas.openxmlformats.org/markup-compatibility/2006" xmlns:m="http://schemas.openxmlformats.org/officeDocument/2006/math" xmlns:aink="http://schemas.microsoft.com/office/drawing/2016/ink" xmlns:am3d="http://schemas.microsoft.com/office/drawing/2017/model3d" xmlns:oel="http://schemas.microsoft.com/office/2019/extlst" xmlns:r="http://schemas.openxmlformats.org/officeDocument/2006/relationships" xmlns:wp14="http://schemas.microsoft.com/office/word/2010/wordprocessingDrawing" xmlns:wp="http://schemas.openxmlformats.org/drawingml/2006/wordprocessingDrawing" xmlns:wpg="http://schemas.microsoft.com/office/word/2010/wordprocessingGroup" xmlns:wpi="http://schemas.microsoft.com/office/word/2010/wordprocessingInk" xmlns:wps="http://schemas.microsoft.com/office/word/2010/wordprocessingShape" xmlns:o="urn:schemas-microsoft-com:office:office" xmlns:v="urn:schemas-microsoft-com:vml" xmlns:w10="urn:schemas-microsoft-com:office:word" xmlns:w="http://schemas.openxmlformats.org/wordprocessingml/2006/main" xmlns:w14="http://schemas.microsoft.com/office/word/2010/wordml" xmlns:w15="http://schemas.microsoft.com/office/word/2012/wordml" xmlns:w16cex="http://schemas.microsoft.com/office/word/2018/wordml/cex" xmlns:w16cid="http://schemas.microsoft.com/office/word/2016/wordml/cid" xmlns:w16="http://schemas.microsoft.com/office/word/2018/wordml" xmlns:w16sdtdh="http://schemas.microsoft.com/office/word/2020/wordml/sdtdatahash" xmlns:w16sdtfl="http://schemas.microsoft.com/office/word/2024/wordml/sdtformatlock" xmlns:w16se="http://schemas.microsoft.com/office/word/2015/wordml/symex" xmlns:w16du="http://schemas.microsoft.com/office/word/2023/wordml/word16du" xmlns:wne="http://schemas.microsoft.com/office/word/2006/wordml" mc:Ignorable="w14 w15 w16se w16cid w16 w16cex w16sdtdh w16sdtfl w16du wp14">
   <w:body>
-    <w:bookmarkStart w:id="13" w:name="summary-jes-public-summary"/>
     <w:p>
       <w:pPr>
-        <w:pStyle w:val="Heading1"/>
-      </w:pPr>
+        <w:pStyle w:val="Heading2"/>
+        <w:jc w:val="both"/>
+        <w:rPr>
+          <w:rFonts w:ascii="Calibri" w:hAnsi="Calibri" w:cs="Calibri"/>
+        </w:rPr>
+      </w:pPr>
+      <w:bookmarkStart w:id="0" w:name="summary-jes-public-summary"/>
+      <w:bookmarkStart w:id="1" w:name="context"/>
       <w:r>
-        <w:t xml:space="preserve">SUMMARY (JeS public summary)</w:t>
+        <w:rPr>
+          <w:rFonts w:ascii="Calibri" w:hAnsi="Calibri" w:cs="Calibri"/>
+        </w:rPr>
+        <w:t>Context</w:t>
       </w:r>
     </w:p>
     <w:p>
       <w:pPr>
         <w:pStyle w:val="FirstParagraph"/>
+        <w:jc w:val="both"/>
+        <w:rPr>
+          <w:rFonts w:ascii="Calibri" w:hAnsi="Calibri" w:cs="Calibri"/>
+        </w:rPr>
       </w:pPr>
       <w:r>
         <w:rPr>
-          <w:b/>
-          <w:bCs/>
-        </w:rPr>
-        <w:t xml:space="preserve">Word limit:</w:t>
-      </w:r>
-      <w:r>
-        <w:t xml:space="preserve"> </w:t>
-      </w:r>
-      <w:r>
-        <w:t xml:space="preserve">550.</w:t>
-      </w:r>
-      <w:r>
-        <w:t xml:space="preserve"> </w:t>
-      </w:r>
-      <w:r>
-        <w:rPr>
-          <w:b/>
-          <w:bCs/>
-        </w:rPr>
-        <w:t xml:space="preserve">Current:</w:t>
-      </w:r>
-      <w:r>
-        <w:t xml:space="preserve"> </w:t>
-      </w:r>
-      <w:r>
-        <w:t xml:space="preserve">489.</w:t>
-      </w:r>
-      <w:r>
-        <w:br/>
-      </w:r>
-      <w:r>
-        <w:rPr>
-          <w:b/>
-          <w:bCs/>
-        </w:rPr>
-        <w:t xml:space="preserve">Source:</w:t>
-      </w:r>
-      <w:r>
-        <w:t xml:space="preserve"> </w:t>
-      </w:r>
-      <w:r>
-        <w:rPr>
-          <w:rStyle w:val="VerbatimChar"/>
-        </w:rPr>
-        <w:t xml:space="preserve">../LaySummary.docx</w:t>
-      </w:r>
-      <w:r>
-        <w:t xml:space="preserve">. Plain English for expert assignment; this text is made publicly available.</w:t>
-      </w:r>
-    </w:p>
-    <w:bookmarkStart w:id="9" w:name="context"/>
-    <w:p>
-      <w:pPr>
-        <w:pStyle w:val="Heading2"/>
-      </w:pPr>
-      <w:r>
-        <w:t xml:space="preserve">Context</w:t>
+          <w:rFonts w:ascii="Calibri" w:hAnsi="Calibri" w:cs="Calibri"/>
+        </w:rPr>
+        <w:t>When two groups compete inside a bounded space, they can organise at several spatial scales at once. In football that can mean a pair of players pressing together, a unit holding a line, and the envelope of space the whole team covers. Those levels coexist. Structure at one scale need not be visible at another. A local grouping can vanish when the whole collection is viewed at once. A gap in the team’s envelope can be invisible among local clusters. That matters because a change at one level is not the same as a change at every level. Distinguishing those levels, and testing whether their structure is visible at the others, is required before organisation can be measured rather than mixed together. This project builds the tools to make those measurements together and to track how competitive pressure reshapes them. Football is the testbed because every player is continuously tracked on a fixed pitch, and coaches can check whether the measurements match what they saw. Other systems share the same organisational problem once their boundary is identified. The boundary may be imposed, as with a pitch, or arise from the agents themselves, as with a contested animal territory.</w:t>
       </w:r>
     </w:p>
     <w:p>
       <w:pPr>
-        <w:pStyle w:val="FirstParagraph"/>
-      </w:pPr>
+        <w:pStyle w:val="Heading2"/>
+        <w:jc w:val="both"/>
+        <w:rPr>
+          <w:rFonts w:ascii="Calibri" w:hAnsi="Calibri" w:cs="Calibri"/>
+        </w:rPr>
+      </w:pPr>
+      <w:bookmarkStart w:id="2" w:name="the-challenge"/>
+      <w:bookmarkEnd w:id="1"/>
       <w:r>
-        <w:t xml:space="preserve">When groups of agents compete inside a bounded space, they organise at several spatial scales at once. Local clusters, larger groupings and the envelope of the whole collection coexist, and each scale hides structure the others cannot see. The situation is like a map that must be read at street, neighbourhood and city zoom simultaneously. This project builds the mathematical tools to measure those levels together and to track how competitive pressure reshapes them. Football is the testbed because every player is continuously tracked on a fixed pitch. Other systems share the same organisational problem once their relevant boundary is identified: it may be imposed, as with a pitch, or arise from the agents themselves, as with a contested animal territory.</w:t>
-      </w:r>
-    </w:p>
-    <w:bookmarkEnd w:id="9"/>
-    <w:bookmarkStart w:id="10" w:name="the-challenge"/>
-    <w:p>
-      <w:pPr>
-        <w:pStyle w:val="Heading2"/>
-      </w:pPr>
-      <w:r>
-        <w:t xml:space="preserve">The Challenge</w:t>
+        <w:rPr>
+          <w:rFonts w:ascii="Calibri" w:hAnsi="Calibri" w:cs="Calibri"/>
+        </w:rPr>
+        <w:t>The Challenge</w:t>
       </w:r>
     </w:p>
     <w:p>
       <w:pPr>
         <w:pStyle w:val="FirstParagraph"/>
+        <w:jc w:val="both"/>
+        <w:rPr>
+          <w:rFonts w:ascii="Calibri" w:hAnsi="Calibri" w:cs="Calibri"/>
+        </w:rPr>
       </w:pPr>
       <w:r>
-        <w:t xml:space="preserve">Two obstacles block existing approaches.</w:t>
+        <w:rPr>
+          <w:rFonts w:ascii="Calibri" w:hAnsi="Calibri" w:cs="Calibri"/>
+        </w:rPr>
+        <w:t>Two obstacles block existing approaches.</w:t>
       </w:r>
     </w:p>
     <w:p>
       <w:pPr>
         <w:pStyle w:val="BodyText"/>
+        <w:jc w:val="both"/>
+        <w:rPr>
+          <w:rFonts w:ascii="Calibri" w:hAnsi="Calibri" w:cs="Calibri"/>
+        </w:rPr>
       </w:pPr>
       <w:r>
-        <w:t xml:space="preserve">The first is scale. Standard shape-analysis tools return a single measurement that conflates every organisational level into one picture, like a map locked to one zoom. Separating those levels in a principled way is a prerequisite for analysis, yet no established method exists.</w:t>
+        <w:rPr>
+          <w:rFonts w:ascii="Calibri" w:hAnsi="Calibri" w:cs="Calibri"/>
+        </w:rPr>
+        <w:t>The first is scale. Standard shape-analysis tools return a single measurement that mixes every organisational level into one picture. That is like a map locked to one zoom: street detail and city outline cannot be read together, and one cannot tell whether a pattern is local, system-wide, or both. Separating those levels in a principled way is a prerequisite for analysis. No established method does this for groups that compete continuously.</w:t>
       </w:r>
     </w:p>
     <w:p>
       <w:pPr>
         <w:pStyle w:val="BodyText"/>
+        <w:jc w:val="both"/>
+        <w:rPr>
+          <w:rFonts w:ascii="Calibri" w:hAnsi="Calibri" w:cs="Calibri"/>
+        </w:rPr>
       </w:pPr>
       <w:r>
-        <w:t xml:space="preserve">The second is dependence. Most statistical tools assume consecutive observations are independent, as with coin flips. Competitive systems are not coin flips: each agent’s movement responds to an opponent and constrains what happens next. Treating that record as independent observations yields invalid inference. New theory is required for the way competitive movement cascades through time and space.</w:t>
-      </w:r>
-    </w:p>
-    <w:bookmarkEnd w:id="10"/>
-    <w:bookmarkStart w:id="11" w:name="aims-and-objectives"/>
-    <w:p>
-      <w:pPr>
-        <w:pStyle w:val="Heading2"/>
-      </w:pPr>
-      <w:r>
-        <w:t xml:space="preserve">Aims and Objectives</w:t>
+        <w:rPr>
+          <w:rFonts w:ascii="Calibri" w:hAnsi="Calibri" w:cs="Calibri"/>
+        </w:rPr>
+        <w:t>The second is dependence. Most statistical tools assume consecutive observations are independent, as with coin flips. Competitive systems are not coin flips. Each agent’s movement responds to the other group and constrains what happens next. Treating that record as independent observations understates uncertainty. A change can look more certain than the data support. New theory is required for the way competitive movement cascades through time and space.</w:t>
       </w:r>
     </w:p>
     <w:p>
       <w:pPr>
-        <w:pStyle w:val="FirstParagraph"/>
-      </w:pPr>
+        <w:pStyle w:val="Heading2"/>
+        <w:jc w:val="both"/>
+        <w:rPr>
+          <w:rFonts w:ascii="Calibri" w:hAnsi="Calibri" w:cs="Calibri"/>
+        </w:rPr>
+      </w:pPr>
+      <w:bookmarkStart w:id="3" w:name="aims-and-objectives"/>
+      <w:bookmarkEnd w:id="2"/>
       <w:r>
-        <w:t xml:space="preserve">The project builds the mathematical foundations for shape-based analysis of competitive collective systems, using professional football as a testbed where all players are tracked and domain experts can check the results. A 10-match pilot has shown that the framework recovers distinct organisational levels and that those levels respond to real match events. This grant scales that foundation across a full Championship season (~540 matches) through two research objectives.</w:t>
+        <w:rPr>
+          <w:rFonts w:ascii="Calibri" w:hAnsi="Calibri" w:cs="Calibri"/>
+        </w:rPr>
+        <w:t>Aims and Objectives</w:t>
       </w:r>
     </w:p>
     <w:p>
       <w:pPr>
-        <w:pStyle w:val="BodyText"/>
+        <w:pStyle w:val="FirstParagraph"/>
+        <w:jc w:val="both"/>
+        <w:rPr>
+          <w:rFonts w:ascii="Calibri" w:hAnsi="Calibri" w:cs="Calibri"/>
+        </w:rPr>
       </w:pPr>
       <w:r>
-        <w:t xml:space="preserve">First, establish whether the multi-level measurements are stably comparable across matches at population scale, and show that they capture information unavailable from conventional statistics. Second, prove mathematical guarantees that the method can detect when collective organisation undergoes a structural transition, with known error, rather than only describing the new state after it has occurred. Full-season results and theoretical foundations are compiled into an evidence pack for a follow-on Standard Grant that tests whether those guarantees transfer to a second bounded competitive system.</w:t>
-      </w:r>
-    </w:p>
-    <w:bookmarkEnd w:id="11"/>
-    <w:bookmarkStart w:id="12" w:name="potential-applications-and-benefits"/>
-    <w:p>
-      <w:pPr>
-        <w:pStyle w:val="Heading2"/>
-      </w:pPr>
-      <w:r>
-        <w:t xml:space="preserve">Potential Applications and Benefits</w:t>
+        <w:rPr>
+          <w:rFonts w:ascii="Calibri" w:hAnsi="Calibri" w:cs="Calibri"/>
+        </w:rPr>
+        <w:t>The project builds the mathematical foundations for shape-based analysis of competitive collective systems: groups of agents that share a bounded domain, each coordinating internally while responding to an opponent. Professional football is the testbed. All players are tracked, and domain experts can check the results. A ten-match pilot has shown that the framework recovers distinct organisational levels and that those levels respond to real match events. This grant scales that foundation across a full English Football League Championship season (about 540 matches) through two research objectives.</w:t>
       </w:r>
     </w:p>
     <w:p>
       <w:pPr>
-        <w:pStyle w:val="FirstParagraph"/>
+        <w:pStyle w:val="BodyText"/>
+        <w:jc w:val="both"/>
+        <w:rPr>
+          <w:rFonts w:ascii="Calibri" w:hAnsi="Calibri" w:cs="Calibri"/>
+        </w:rPr>
       </w:pPr>
       <w:r>
-        <w:t xml:space="preserve">This award delivers the football-validated theory and software. Transfer to another system is a later step, once interaction lengths are re-derived. The follow-on Standard Grant will test whether those guarantees transfer to spatial predator–prey dynamics, including cellular competition relevant to cancer biology through mathematical-oncology collaborators brought in for that programme.</w:t>
+        <w:rPr>
+          <w:rFonts w:ascii="Calibri" w:hAnsi="Calibri" w:cs="Calibri"/>
+        </w:rPr>
+        <w:t xml:space="preserve">First, establish whether the multi-level measurements are stable enough to compare across matches at population scale. If they jump from match to match, they cannot be averaged. Show </w:t>
+      </w:r>
+      <w:r>
+        <w:rPr>
+          <w:rFonts w:ascii="Calibri" w:hAnsi="Calibri" w:cs="Calibri"/>
+        </w:rPr>
+        <w:lastRenderedPageBreak/>
+        <w:t>that they capture information unavailable from conventional statistics such as team length, width and the area of the polygon around the team.</w:t>
       </w:r>
     </w:p>
     <w:p>
       <w:pPr>
         <w:pStyle w:val="BodyText"/>
+        <w:jc w:val="both"/>
+        <w:rPr>
+          <w:rFonts w:ascii="Calibri" w:hAnsi="Calibri" w:cs="Calibri"/>
+        </w:rPr>
       </w:pPr>
       <w:r>
-        <w:t xml:space="preserve">The primary output is a documented, containerised open-source package that computes multi-scale topological summaries from tracking data, released with a DOI. Swansea City AFC and StatsBomb co-develop the work: the club receives structural measures of pressing, formation gaps and defensive-line organisation, while the data partner receives a candidate feature set beyond conventional geometry. The evidence pack supports the follow-on Standard Grant.</w:t>
+        <w:rPr>
+          <w:rFonts w:ascii="Calibri" w:hAnsi="Calibri" w:cs="Calibri"/>
+        </w:rPr>
+        <w:t>Second, prove mathematical guarantees that the method can detect when collective organisation undergoes a structural transition, with a known error, rather than only describing the new state after it has occurred. The error bound says how close the detected time is to the true change.</w:t>
       </w:r>
     </w:p>
-    <w:bookmarkEnd w:id="12"/>
-    <w:bookmarkEnd w:id="13"/>
+    <w:p>
+      <w:pPr>
+        <w:pStyle w:val="Heading2"/>
+        <w:jc w:val="both"/>
+        <w:rPr>
+          <w:rFonts w:ascii="Calibri" w:hAnsi="Calibri" w:cs="Calibri"/>
+        </w:rPr>
+      </w:pPr>
+      <w:bookmarkStart w:id="4" w:name="potential-applications-and-benefits"/>
+      <w:bookmarkEnd w:id="3"/>
+      <w:r>
+        <w:rPr>
+          <w:rFonts w:ascii="Calibri" w:hAnsi="Calibri" w:cs="Calibri"/>
+        </w:rPr>
+        <w:t>Potential Applications and Benefits</w:t>
+      </w:r>
+    </w:p>
+    <w:p>
+      <w:pPr>
+        <w:pStyle w:val="FirstParagraph"/>
+        <w:jc w:val="both"/>
+        <w:rPr>
+          <w:rFonts w:ascii="Calibri" w:hAnsi="Calibri" w:cs="Calibri"/>
+        </w:rPr>
+      </w:pPr>
+      <w:r>
+        <w:rPr>
+          <w:rFonts w:ascii="Calibri" w:hAnsi="Calibri" w:cs="Calibri"/>
+        </w:rPr>
+        <w:t>This project will deliver football-validated theory and software. The novelty is a scale-separated analysis that also accounts for competitive dependence: successive observations are not independent. Conventional length, width and hull measures cannot provide that. The primary output is a documented open-source package that computes multi-scale shape summaries from tracking data. It is released in a container so it runs the same way on other machines, with a digital object identifier (DOI) so others can cite and reuse it. Swansea City Association Football Club and StatsBomb co-develop the work. The club receives structural measures of pressing, formation gaps and defensive-line organisation that can be checked against match events. The data partner receives a candidate feature set beyond conventional geometry.</w:t>
+      </w:r>
+    </w:p>
+    <w:p>
+      <w:pPr>
+        <w:pStyle w:val="BodyText"/>
+        <w:jc w:val="both"/>
+        <w:rPr>
+          <w:rFonts w:ascii="Calibri" w:hAnsi="Calibri" w:cs="Calibri"/>
+        </w:rPr>
+      </w:pPr>
+      <w:r>
+        <w:rPr>
+          <w:rFonts w:ascii="Calibri" w:hAnsi="Calibri" w:cs="Calibri"/>
+        </w:rPr>
+        <w:t>The same organisational problem, competing groups inside a bounded domain, appears in spatial predator–prey dynamics, including the competition between tumour cells and immune cells. A second later target is competitive logistics with autonomous-fleet coordination. Neither is a deliverable of this award. Transfer is a later step, once the interaction lengths of those systems are re-derived from their own data. The football results remain useful whether or not that later transfer is funded. Full-season results and theoretical foundations are compiled into an evidence pack. That pack will support a follow-on Standard Grant application that tests whether the averaging and detection guarantees transfer to those systems, through mathematical-oncology collaborations specific to that programme.</w:t>
+      </w:r>
+    </w:p>
+    <w:bookmarkEnd w:id="0"/>
+    <w:bookmarkEnd w:id="4"/>
+    <w:p>
+      <w:pPr>
+        <w:pStyle w:val="BodyText"/>
+        <w:jc w:val="both"/>
+        <w:rPr>
+          <w:rFonts w:ascii="Calibri" w:hAnsi="Calibri" w:cs="Calibri"/>
+        </w:rPr>
+      </w:pPr>
+    </w:p>
     <w:sectPr>
       <w:footnotePr>
         <w:numRestart w:val="eachSect"/>
       </w:footnotePr>
+      <w:pgSz w:w="12240" w:h="15840"/>
+      <w:pgMar w:top="1440" w:right="1440" w:bottom="1440" w:left="1440" w:header="720" w:footer="720" w:gutter="0"/>
+      <w:cols w:space="720"/>
     </w:sectPr>
   </w:body>
 </w:document>
 </file>
 
-<file path=word/comments.xml><?xml version="1.0" encoding="utf-8"?>
-<w:comments xmlns:w="http://schemas.openxmlformats.org/wordprocessingml/2006/main" xmlns:m="http://schemas.openxmlformats.org/officeDocument/2006/math" xmlns:r="http://schemas.openxmlformats.org/officeDocument/2006/relationships" xmlns:o="urn:schemas-microsoft-com:office:office" xmlns:v="urn:schemas-microsoft-com:vml" xmlns:w10="urn:schemas-microsoft-com:office:word" xmlns:a="http://schemas.openxmlformats.org/drawingml/2006/main" xmlns:pic="http://schemas.openxmlformats.org/drawingml/2006/picture" xmlns:wp="http://schemas.openxmlformats.org/drawingml/2006/wordprocessingDrawing"/>
-</file>
-
-<file path=word/footnotes.xml><?xml version="1.0" encoding="utf-8"?>
-<w:footnotes xmlns:w="http://schemas.openxmlformats.org/wordprocessingml/2006/main" xmlns:m="http://schemas.openxmlformats.org/officeDocument/2006/math" xmlns:r="http://schemas.openxmlformats.org/officeDocument/2006/relationships" xmlns:o="urn:schemas-microsoft-com:office:office" xmlns:v="urn:schemas-microsoft-com:vml" xmlns:w10="urn:schemas-microsoft-com:office:word" xmlns:a="http://schemas.openxmlformats.org/drawingml/2006/main" xmlns:pic="http://schemas.openxmlformats.org/drawingml/2006/picture" xmlns:wp="http://schemas.openxmlformats.org/drawingml/2006/wordprocessingDrawing">
-  <w:footnote w:type="continuationSeparator" w:id="0">
-    <w:p>
-      <w:r>
-        <w:continuationSeparator/>
-      </w:r>
-    </w:p>
-  </w:footnote>
-  <w:footnote w:type="separator" w:id="-1">
-    <w:p>
-      <w:r>
-        <w:separator/>
-      </w:r>
-    </w:p>
-  </w:footnote>
-</w:footnotes>
-</file>
-
 <file path=word/numbering.xml><?xml version="1.0" encoding="utf-8"?>
-<w:numbering xmlns:w="http://schemas.openxmlformats.org/wordprocessingml/2006/main">
-  <w:abstractNum w:abstractNumId="990">
+<w:numbering xmlns:wpc="http://schemas.microsoft.com/office/word/2010/wordprocessingCanvas" xmlns:cx="http://schemas.microsoft.com/office/drawing/2014/chartex" xmlns:cx1="http://schemas.microsoft.com/office/drawing/2015/9/8/chartex" xmlns:cx2="http://schemas.microsoft.com/office/drawing/2015/10/21/chartex" xmlns:cx3="http://schemas.microsoft.com/office/drawing/2016/5/9/chartex" xmlns:cx4="http://schemas.microsoft.com/office/drawing/2016/5/10/chartex" xmlns:cx5="http://schemas.microsoft.com/office/drawing/2016/5/11/chartex" xmlns:cx6="http://schemas.microsoft.com/office/drawing/2016/5/12/chartex" xmlns:cx7="http://schemas.microsoft.com/office/drawing/2016/5/13/chartex" xmlns:cx8="http://schemas.microsoft.com/office/drawing/2016/5/14/chartex" xmlns:mc="http://schemas.openxmlformats.org/markup-compatibility/2006" xmlns:m="http://schemas.openxmlformats.org/officeDocument/2006/math" xmlns:aink="http://schemas.microsoft.com/office/drawing/2016/ink" xmlns:am3d="http://schemas.microsoft.com/office/drawing/2017/model3d" xmlns:oel="http://schemas.microsoft.com/office/2019/extlst" xmlns:r="http://schemas.openxmlformats.org/officeDocument/2006/relationships" xmlns:wp14="http://schemas.microsoft.com/office/word/2010/wordprocessingDrawing" xmlns:wp="http://schemas.openxmlformats.org/drawingml/2006/wordprocessingDrawing" xmlns:wpg="http://schemas.microsoft.com/office/word/2010/wordprocessingGroup" xmlns:wpi="http://schemas.microsoft.com/office/word/2010/wordprocessingInk" xmlns:wps="http://schemas.microsoft.com/office/word/2010/wordprocessingShape" xmlns:o="urn:schemas-microsoft-com:office:office" xmlns:v="urn:schemas-microsoft-com:vml" xmlns:w10="urn:schemas-microsoft-com:office:word" xmlns:w="http://schemas.openxmlformats.org/wordprocessingml/2006/main" xmlns:w14="http://schemas.microsoft.com/office/word/2010/wordml" xmlns:w15="http://schemas.microsoft.com/office/word/2012/wordml" xmlns:w16cex="http://schemas.microsoft.com/office/word/2018/wordml/cex" xmlns:w16cid="http://schemas.microsoft.com/office/word/2016/wordml/cid" xmlns:w16="http://schemas.microsoft.com/office/word/2018/wordml" xmlns:w16sdtdh="http://schemas.microsoft.com/office/word/2020/wordml/sdtdatahash" xmlns:w16sdtfl="http://schemas.microsoft.com/office/word/2024/wordml/sdtformatlock" xmlns:w16se="http://schemas.microsoft.com/office/word/2015/wordml/symex" xmlns:w16du="http://schemas.microsoft.com/office/word/2023/wordml/word16du" xmlns:wne="http://schemas.microsoft.com/office/word/2006/wordml" mc:Ignorable="w14 w15 w16se w16cid w16 w16cex w16sdtdh w16sdtfl w16du wp14">
+  <w:abstractNum w:abstractNumId="0" w15:restartNumberingAfterBreak="0">
     <w:nsid w:val="0000A990"/>
     <w:multiLevelType w:val="multilevel"/>
+    <w:tmpl w:val="87229456"/>
     <w:lvl w:ilvl="0">
       <w:numFmt w:val="bullet"/>
       <w:lvlText w:val=" "/>
@@ -282,21 +314,21 @@
       </w:pPr>
     </w:lvl>
   </w:abstractNum>
-  <w:num w:numId="1000">
-    <w:abstractNumId w:val="990"/>
+  <w:num w:numId="1" w16cid:durableId="480973308">
+    <w:abstractNumId w:val="0"/>
   </w:num>
 </w:numbering>
 </file>
 
 <file path=word/styles.xml><?xml version="1.0" encoding="utf-8"?>
-<w:styles xmlns:r="http://schemas.openxmlformats.org/officeDocument/2006/relationships" xmlns:w="http://schemas.openxmlformats.org/wordprocessingml/2006/main">
+<w:styles xmlns:mc="http://schemas.openxmlformats.org/markup-compatibility/2006" xmlns:r="http://schemas.openxmlformats.org/officeDocument/2006/relationships" xmlns:w="http://schemas.openxmlformats.org/wordprocessingml/2006/main" xmlns:w14="http://schemas.microsoft.com/office/word/2010/wordml" xmlns:w15="http://schemas.microsoft.com/office/word/2012/wordml" xmlns:w16cex="http://schemas.microsoft.com/office/word/2018/wordml/cex" xmlns:w16cid="http://schemas.microsoft.com/office/word/2016/wordml/cid" xmlns:w16="http://schemas.microsoft.com/office/word/2018/wordml" xmlns:w16sdtdh="http://schemas.microsoft.com/office/word/2020/wordml/sdtdatahash" xmlns:w16sdtfl="http://schemas.microsoft.com/office/word/2024/wordml/sdtformatlock" xmlns:w16se="http://schemas.microsoft.com/office/word/2015/wordml/symex" xmlns:w16du="http://schemas.microsoft.com/office/word/2023/wordml/word16du" mc:Ignorable="w14 w15 w16se w16cid w16 w16cex w16sdtdh w16sdtfl w16du">
   <w:docDefaults>
     <w:rPrDefault>
       <w:rPr>
-        <w:rFonts w:asciiTheme="minorHAnsi" w:cstheme="minorBidi" w:eastAsiaTheme="minorEastAsia" w:hAnsiTheme="minorHAnsi"/>
+        <w:rFonts w:asciiTheme="minorHAnsi" w:eastAsiaTheme="minorEastAsia" w:hAnsiTheme="minorHAnsi" w:cstheme="minorBidi"/>
         <w:sz w:val="24"/>
         <w:szCs w:val="24"/>
-        <w:lang w:bidi="ar-SA" w:eastAsia="zh-CN" w:val="en-US"/>
+        <w:lang w:val="en-US" w:eastAsia="zh-CN" w:bidi="ar-SA"/>
       </w:rPr>
     </w:rPrDefault>
     <w:pPrDefault>
@@ -305,35 +337,503 @@
       </w:pPr>
     </w:pPrDefault>
   </w:docDefaults>
-  <w:latentStyles w:count="276" w:defLockedState="0" w:defQFormat="0" w:defSemiHidden="0" w:defUIPriority="0" w:defUnhideWhenUsed="0"/>
-  <w:style w:default="1" w:styleId="Normal" w:type="paragraph">
+  <w:latentStyles w:defLockedState="0" w:defUIPriority="0" w:defSemiHidden="0" w:defUnhideWhenUsed="0" w:defQFormat="0" w:count="376">
+    <w:lsdException w:name="Normal Table" w:semiHidden="1" w:unhideWhenUsed="1"/>
+    <w:lsdException w:name="Table Simple 1" w:semiHidden="1" w:unhideWhenUsed="1"/>
+    <w:lsdException w:name="Table Simple 2" w:semiHidden="1" w:unhideWhenUsed="1"/>
+    <w:lsdException w:name="Table Simple 3" w:semiHidden="1" w:unhideWhenUsed="1"/>
+    <w:lsdException w:name="Table Classic 1" w:semiHidden="1" w:unhideWhenUsed="1"/>
+    <w:lsdException w:name="Table Classic 2" w:semiHidden="1" w:unhideWhenUsed="1"/>
+    <w:lsdException w:name="Table Classic 3" w:semiHidden="1" w:unhideWhenUsed="1"/>
+    <w:lsdException w:name="Table Classic 4" w:semiHidden="1" w:unhideWhenUsed="1"/>
+    <w:lsdException w:name="Table Colorful 1" w:semiHidden="1" w:unhideWhenUsed="1"/>
+    <w:lsdException w:name="Table Colorful 2" w:semiHidden="1" w:unhideWhenUsed="1"/>
+    <w:lsdException w:name="Table Colorful 3" w:semiHidden="1" w:unhideWhenUsed="1"/>
+    <w:lsdException w:name="Table Columns 1" w:semiHidden="1" w:unhideWhenUsed="1"/>
+    <w:lsdException w:name="Table Columns 2" w:semiHidden="1" w:unhideWhenUsed="1"/>
+    <w:lsdException w:name="Table Columns 3" w:semiHidden="1" w:unhideWhenUsed="1"/>
+    <w:lsdException w:name="Table Columns 4" w:semiHidden="1" w:unhideWhenUsed="1"/>
+    <w:lsdException w:name="Table Columns 5" w:semiHidden="1" w:unhideWhenUsed="1"/>
+    <w:lsdException w:name="Table Grid 1" w:semiHidden="1" w:unhideWhenUsed="1"/>
+    <w:lsdException w:name="Table Grid 2" w:semiHidden="1" w:unhideWhenUsed="1"/>
+    <w:lsdException w:name="Table Grid 3" w:semiHidden="1" w:unhideWhenUsed="1"/>
+    <w:lsdException w:name="Table Grid 4" w:semiHidden="1" w:unhideWhenUsed="1"/>
+    <w:lsdException w:name="Table Grid 5" w:semiHidden="1" w:unhideWhenUsed="1"/>
+    <w:lsdException w:name="Table Grid 6" w:semiHidden="1" w:unhideWhenUsed="1"/>
+    <w:lsdException w:name="Table Grid 7" w:semiHidden="1" w:unhideWhenUsed="1"/>
+    <w:lsdException w:name="Table Grid 8" w:semiHidden="1" w:unhideWhenUsed="1"/>
+    <w:lsdException w:name="Table List 1" w:semiHidden="1" w:unhideWhenUsed="1"/>
+    <w:lsdException w:name="Table List 2" w:semiHidden="1" w:unhideWhenUsed="1"/>
+    <w:lsdException w:name="Table List 3" w:semiHidden="1" w:unhideWhenUsed="1"/>
+    <w:lsdException w:name="Table List 4" w:semiHidden="1" w:unhideWhenUsed="1"/>
+    <w:lsdException w:name="Table List 5" w:semiHidden="1" w:unhideWhenUsed="1"/>
+    <w:lsdException w:name="Table List 6" w:semiHidden="1" w:unhideWhenUsed="1"/>
+    <w:lsdException w:name="Table List 7" w:semiHidden="1" w:unhideWhenUsed="1"/>
+    <w:lsdException w:name="Table List 8" w:semiHidden="1" w:unhideWhenUsed="1"/>
+    <w:lsdException w:name="Table 3D effects 1" w:semiHidden="1" w:unhideWhenUsed="1"/>
+    <w:lsdException w:name="Table 3D effects 2" w:semiHidden="1" w:unhideWhenUsed="1"/>
+    <w:lsdException w:name="Table 3D effects 3" w:semiHidden="1" w:unhideWhenUsed="1"/>
+    <w:lsdException w:name="Table Contemporary" w:semiHidden="1" w:unhideWhenUsed="1"/>
+    <w:lsdException w:name="Table Elegant" w:semiHidden="1" w:unhideWhenUsed="1"/>
+    <w:lsdException w:name="Table Professional" w:semiHidden="1" w:unhideWhenUsed="1"/>
+    <w:lsdException w:name="Table Subtle 1" w:semiHidden="1" w:unhideWhenUsed="1"/>
+    <w:lsdException w:name="Table Subtle 2" w:semiHidden="1" w:unhideWhenUsed="1"/>
+    <w:lsdException w:name="Table Web 1" w:semiHidden="1" w:unhideWhenUsed="1"/>
+    <w:lsdException w:name="Table Web 2" w:semiHidden="1" w:unhideWhenUsed="1"/>
+    <w:lsdException w:name="Table Web 3" w:semiHidden="1" w:unhideWhenUsed="1"/>
+    <w:lsdException w:name="Table Theme" w:semiHidden="1" w:unhideWhenUsed="1"/>
+    <w:lsdException w:name="Light Shading"/>
+    <w:lsdException w:name="Light List"/>
+    <w:lsdException w:name="Light Grid"/>
+    <w:lsdException w:name="Medium Shading 1"/>
+    <w:lsdException w:name="Medium Shading 2"/>
+    <w:lsdException w:name="Medium List 1"/>
+    <w:lsdException w:name="Medium List 2"/>
+    <w:lsdException w:name="Medium Grid 1"/>
+    <w:lsdException w:name="Medium Grid 2"/>
+    <w:lsdException w:name="Medium Grid 3"/>
+    <w:lsdException w:name="Dark List"/>
+    <w:lsdException w:name="Colorful Shading"/>
+    <w:lsdException w:name="Colorful List"/>
+    <w:lsdException w:name="Colorful Grid"/>
+    <w:lsdException w:name="Light Shading Accent 1"/>
+    <w:lsdException w:name="Light List Accent 1"/>
+    <w:lsdException w:name="Light Grid Accent 1"/>
+    <w:lsdException w:name="Medium Shading 1 Accent 1"/>
+    <w:lsdException w:name="Medium Shading 2 Accent 1"/>
+    <w:lsdException w:name="Medium List 1 Accent 1"/>
+    <w:lsdException w:name="Medium List 2 Accent 1"/>
+    <w:lsdException w:name="Medium Grid 1 Accent 1"/>
+    <w:lsdException w:name="Medium Grid 2 Accent 1"/>
+    <w:lsdException w:name="Medium Grid 3 Accent 1"/>
+    <w:lsdException w:name="Dark List Accent 1"/>
+    <w:lsdException w:name="Colorful Shading Accent 1"/>
+    <w:lsdException w:name="Colorful List Accent 1"/>
+    <w:lsdException w:name="Colorful Grid Accent 1"/>
+    <w:lsdException w:name="Light Shading Accent 2"/>
+    <w:lsdException w:name="Light List Accent 2"/>
+    <w:lsdException w:name="Light Grid Accent 2"/>
+    <w:lsdException w:name="Medium Shading 1 Accent 2"/>
+    <w:lsdException w:name="Medium Shading 2 Accent 2"/>
+    <w:lsdException w:name="Medium List 1 Accent 2"/>
+    <w:lsdException w:name="Medium List 2 Accent 2"/>
+    <w:lsdException w:name="Medium Grid 1 Accent 2"/>
+    <w:lsdException w:name="Medium Grid 2 Accent 2"/>
+    <w:lsdException w:name="Medium Grid 3 Accent 2"/>
+    <w:lsdException w:name="Dark List Accent 2"/>
+    <w:lsdException w:name="Colorful Shading Accent 2"/>
+    <w:lsdException w:name="Colorful List Accent 2"/>
+    <w:lsdException w:name="Colorful Grid Accent 2"/>
+    <w:lsdException w:name="Light Shading Accent 3"/>
+    <w:lsdException w:name="Light List Accent 3"/>
+    <w:lsdException w:name="Light Grid Accent 3"/>
+    <w:lsdException w:name="Medium Shading 1 Accent 3"/>
+    <w:lsdException w:name="Medium Shading 2 Accent 3"/>
+    <w:lsdException w:name="Medium List 1 Accent 3"/>
+    <w:lsdException w:name="Medium List 2 Accent 3"/>
+    <w:lsdException w:name="Medium Grid 1 Accent 3"/>
+    <w:lsdException w:name="Medium Grid 2 Accent 3"/>
+    <w:lsdException w:name="Medium Grid 3 Accent 3"/>
+    <w:lsdException w:name="Dark List Accent 3"/>
+    <w:lsdException w:name="Colorful Shading Accent 3"/>
+    <w:lsdException w:name="Colorful List Accent 3"/>
+    <w:lsdException w:name="Colorful Grid Accent 3"/>
+    <w:lsdException w:name="Light Shading Accent 4"/>
+    <w:lsdException w:name="Light List Accent 4"/>
+    <w:lsdException w:name="Light Grid Accent 4"/>
+    <w:lsdException w:name="Medium Shading 1 Accent 4"/>
+    <w:lsdException w:name="Medium Shading 2 Accent 4"/>
+    <w:lsdException w:name="Medium List 1 Accent 4"/>
+    <w:lsdException w:name="Medium List 2 Accent 4"/>
+    <w:lsdException w:name="Medium Grid 1 Accent 4"/>
+    <w:lsdException w:name="Medium Grid 2 Accent 4"/>
+    <w:lsdException w:name="Medium Grid 3 Accent 4"/>
+    <w:lsdException w:name="Dark List Accent 4"/>
+    <w:lsdException w:name="Colorful Shading Accent 4"/>
+    <w:lsdException w:name="Colorful List Accent 4"/>
+    <w:lsdException w:name="Colorful Grid Accent 4"/>
+    <w:lsdException w:name="Light Shading Accent 5"/>
+    <w:lsdException w:name="Light List Accent 5"/>
+    <w:lsdException w:name="Light Grid Accent 5"/>
+    <w:lsdException w:name="Medium Shading 1 Accent 5"/>
+    <w:lsdException w:name="Medium Shading 2 Accent 5"/>
+    <w:lsdException w:name="Medium List 1 Accent 5"/>
+    <w:lsdException w:name="Medium List 2 Accent 5"/>
+    <w:lsdException w:name="Medium Grid 1 Accent 5"/>
+    <w:lsdException w:name="Medium Grid 2 Accent 5"/>
+    <w:lsdException w:name="Medium Grid 3 Accent 5"/>
+    <w:lsdException w:name="Dark List Accent 5"/>
+    <w:lsdException w:name="Colorful Shading Accent 5"/>
+    <w:lsdException w:name="Colorful List Accent 5"/>
+    <w:lsdException w:name="Colorful Grid Accent 5"/>
+    <w:lsdException w:name="Light Shading Accent 6"/>
+    <w:lsdException w:name="Light List Accent 6"/>
+    <w:lsdException w:name="Light Grid Accent 6"/>
+    <w:lsdException w:name="Medium Shading 1 Accent 6"/>
+    <w:lsdException w:name="Medium Shading 2 Accent 6"/>
+    <w:lsdException w:name="Medium List 1 Accent 6"/>
+    <w:lsdException w:name="Medium List 2 Accent 6"/>
+    <w:lsdException w:name="Medium Grid 1 Accent 6"/>
+    <w:lsdException w:name="Medium Grid 2 Accent 6"/>
+    <w:lsdException w:name="Medium Grid 3 Accent 6"/>
+    <w:lsdException w:name="Dark List Accent 6"/>
+    <w:lsdException w:name="Colorful Shading Accent 6"/>
+    <w:lsdException w:name="Colorful List Accent 6"/>
+    <w:lsdException w:name="Colorful Grid Accent 6"/>
+    <w:lsdException w:name="Grid Table 4" w:uiPriority="49"/>
+    <w:lsdException w:name="Grid Table 5 Dark" w:uiPriority="50"/>
+    <w:lsdException w:name="Grid Table 6 Colorful" w:uiPriority="51"/>
+    <w:lsdException w:name="Grid Table 7 Colorful" w:uiPriority="52"/>
+    <w:lsdException w:name="Grid Table 1 Light Accent 1" w:uiPriority="46"/>
+    <w:lsdException w:name="Grid Table 2 Accent 1" w:uiPriority="47"/>
+    <w:lsdException w:name="Grid Table 3 Accent 1" w:uiPriority="48"/>
+    <w:lsdException w:name="Grid Table 4 Accent 1" w:uiPriority="49"/>
+    <w:lsdException w:name="Grid Table 5 Dark Accent 1" w:uiPriority="50"/>
+    <w:lsdException w:name="Grid Table 6 Colorful Accent 1" w:uiPriority="51"/>
+    <w:lsdException w:name="Grid Table 7 Colorful Accent 1" w:uiPriority="52"/>
+    <w:lsdException w:name="Grid Table 1 Light Accent 2" w:uiPriority="46"/>
+    <w:lsdException w:name="Grid Table 2 Accent 2" w:uiPriority="47"/>
+    <w:lsdException w:name="Grid Table 3 Accent 2" w:uiPriority="48"/>
+    <w:lsdException w:name="Grid Table 4 Accent 2" w:uiPriority="49"/>
+    <w:lsdException w:name="Grid Table 5 Dark Accent 2" w:uiPriority="50"/>
+    <w:lsdException w:name="Grid Table 6 Colorful Accent 2" w:uiPriority="51"/>
+    <w:lsdException w:name="Grid Table 7 Colorful Accent 2" w:uiPriority="52"/>
+    <w:lsdException w:name="Grid Table 1 Light Accent 3" w:uiPriority="46"/>
+    <w:lsdException w:name="Grid Table 2 Accent 3" w:uiPriority="47"/>
+    <w:lsdException w:name="Grid Table 3 Accent 3" w:uiPriority="48"/>
+    <w:lsdException w:name="Grid Table 4 Accent 3" w:uiPriority="49"/>
+    <w:lsdException w:name="Grid Table 5 Dark Accent 3" w:uiPriority="50"/>
+    <w:lsdException w:name="Grid Table 6 Colorful Accent 3" w:uiPriority="51"/>
+    <w:lsdException w:name="Grid Table 7 Colorful Accent 3" w:uiPriority="52"/>
+    <w:lsdException w:name="Grid Table 1 Light Accent 4" w:uiPriority="46"/>
+    <w:lsdException w:name="Grid Table 2 Accent 4" w:uiPriority="47"/>
+    <w:lsdException w:name="Grid Table 3 Accent 4" w:uiPriority="48"/>
+    <w:lsdException w:name="Grid Table 4 Accent 4" w:uiPriority="49"/>
+    <w:lsdException w:name="Grid Table 5 Dark Accent 4" w:uiPriority="50"/>
+    <w:lsdException w:name="Grid Table 6 Colorful Accent 4" w:uiPriority="51"/>
+    <w:lsdException w:name="Grid Table 7 Colorful Accent 4" w:uiPriority="52"/>
+    <w:lsdException w:name="Grid Table 1 Light Accent 5" w:uiPriority="46"/>
+    <w:lsdException w:name="Grid Table 2 Accent 5" w:uiPriority="47"/>
+    <w:lsdException w:name="Grid Table 3 Accent 5" w:uiPriority="48"/>
+    <w:lsdException w:name="Grid Table 4 Accent 5" w:uiPriority="49"/>
+    <w:lsdException w:name="Grid Table 5 Dark Accent 5" w:uiPriority="50"/>
+    <w:lsdException w:name="Grid Table 6 Colorful Accent 5" w:uiPriority="51"/>
+    <w:lsdException w:name="Grid Table 7 Colorful Accent 5" w:uiPriority="52"/>
+    <w:lsdException w:name="Grid Table 1 Light Accent 6" w:uiPriority="46"/>
+    <w:lsdException w:name="Grid Table 2 Accent 6" w:uiPriority="47"/>
+    <w:lsdException w:name="Grid Table 3 Accent 6" w:uiPriority="48"/>
+    <w:lsdException w:name="Grid Table 4 Accent 6" w:uiPriority="49"/>
+    <w:lsdException w:name="Grid Table 5 Dark Accent 6" w:uiPriority="50"/>
+    <w:lsdException w:name="Grid Table 6 Colorful Accent 6" w:uiPriority="51"/>
+    <w:lsdException w:name="Grid Table 7 Colorful Accent 6" w:uiPriority="52"/>
+    <w:lsdException w:name="List Table 1 Light" w:uiPriority="46"/>
+    <w:lsdException w:name="List Table 2" w:uiPriority="47"/>
+    <w:lsdException w:name="List Table 3" w:uiPriority="48"/>
+    <w:lsdException w:name="List Table 4" w:uiPriority="49"/>
+    <w:lsdException w:name="List Table 5 Dark" w:uiPriority="50"/>
+    <w:lsdException w:name="List Table 6 Colorful" w:uiPriority="51"/>
+    <w:lsdException w:name="List Table 7 Colorful" w:uiPriority="52"/>
+    <w:lsdException w:name="List Table 1 Light Accent 1" w:uiPriority="46"/>
+    <w:lsdException w:name="List Table 2 Accent 1" w:uiPriority="47"/>
+    <w:lsdException w:name="List Table 3 Accent 1" w:uiPriority="48"/>
+    <w:lsdException w:name="List Table 4 Accent 1" w:uiPriority="49"/>
+    <w:lsdException w:name="List Table 5 Dark Accent 1" w:uiPriority="50"/>
+    <w:lsdException w:name="List Table 6 Colorful Accent 1" w:uiPriority="51"/>
+    <w:lsdException w:name="List Table 7 Colorful Accent 1" w:uiPriority="52"/>
+    <w:lsdException w:name="List Table 1 Light Accent 2" w:uiPriority="46"/>
+    <w:lsdException w:name="List Table 2 Accent 2" w:uiPriority="47"/>
+    <w:lsdException w:name="List Table 3 Accent 2" w:uiPriority="48"/>
+    <w:lsdException w:name="List Table 4 Accent 2" w:uiPriority="49"/>
+    <w:lsdException w:name="List Table 5 Dark Accent 2" w:uiPriority="50"/>
+    <w:lsdException w:name="List Table 6 Colorful Accent 2" w:uiPriority="51"/>
+    <w:lsdException w:name="List Table 7 Colorful Accent 2" w:uiPriority="52"/>
+    <w:lsdException w:name="List Table 1 Light Accent 3" w:uiPriority="46"/>
+    <w:lsdException w:name="List Table 2 Accent 3" w:uiPriority="47"/>
+    <w:lsdException w:name="List Table 3 Accent 3" w:uiPriority="48"/>
+    <w:lsdException w:name="List Table 4 Accent 3" w:uiPriority="49"/>
+    <w:lsdException w:name="List Table 5 Dark Accent 3" w:uiPriority="50"/>
+    <w:lsdException w:name="List Table 6 Colorful Accent 3" w:uiPriority="51"/>
+    <w:lsdException w:name="List Table 7 Colorful Accent 3" w:uiPriority="52"/>
+    <w:lsdException w:name="List Table 1 Light Accent 4" w:uiPriority="46"/>
+    <w:lsdException w:name="List Table 2 Accent 4" w:uiPriority="47"/>
+    <w:lsdException w:name="List Table 3 Accent 4" w:uiPriority="48"/>
+    <w:lsdException w:name="List Table 4 Accent 4" w:uiPriority="49"/>
+    <w:lsdException w:name="List Table 5 Dark Accent 4" w:uiPriority="50"/>
+    <w:lsdException w:name="List Table 6 Colorful Accent 4" w:uiPriority="51"/>
+    <w:lsdException w:name="List Table 7 Colorful Accent 4" w:uiPriority="52"/>
+    <w:lsdException w:name="List Table 1 Light Accent 5" w:uiPriority="46"/>
+    <w:lsdException w:name="List Table 2 Accent 5" w:uiPriority="47"/>
+    <w:lsdException w:name="List Table 3 Accent 5" w:uiPriority="48"/>
+    <w:lsdException w:name="List Table 4 Accent 5" w:uiPriority="49"/>
+    <w:lsdException w:name="List Table 5 Dark Accent 5" w:uiPriority="50"/>
+    <w:lsdException w:name="List Table 6 Colorful Accent 5" w:uiPriority="51"/>
+    <w:lsdException w:name="List Table 7 Colorful Accent 5" w:uiPriority="52"/>
+    <w:lsdException w:name="List Table 1 Light Accent 6" w:uiPriority="46"/>
+    <w:lsdException w:name="List Table 2 Accent 6" w:uiPriority="47"/>
+    <w:lsdException w:name="List Table 3 Accent 6" w:uiPriority="48"/>
+    <w:lsdException w:name="List Table 4 Accent 6" w:uiPriority="49"/>
+    <w:lsdException w:name="List Table 5 Dark Accent 6" w:uiPriority="50"/>
+    <w:lsdException w:name="List Table 6 Colorful Accent 6" w:uiPriority="51"/>
+    <w:lsdException w:name="List Table 7 Colorful Accent 6" w:uiPriority="52"/>
+    <w:lsdException w:name="Mention" w:semiHidden="1" w:uiPriority="99" w:unhideWhenUsed="1"/>
+    <w:lsdException w:name="Smart Hyperlink" w:semiHidden="1" w:uiPriority="99" w:unhideWhenUsed="1"/>
+    <w:lsdException w:name="Hashtag" w:semiHidden="1" w:uiPriority="99" w:unhideWhenUsed="1"/>
+    <w:lsdException w:name="Unresolved Mention" w:semiHidden="1" w:uiPriority="99" w:unhideWhenUsed="1"/>
+    <w:lsdException w:name="Smart Link" w:semiHidden="1" w:uiPriority="99" w:unhideWhenUsed="1"/>
+  </w:latentStyles>
+  <w:style w:type="paragraph" w:default="1" w:styleId="Normal">
     <w:name w:val="Normal"/>
     <w:qFormat/>
   </w:style>
-  <w:style w:styleId="BodyText" w:type="paragraph">
+  <w:style w:type="paragraph" w:styleId="Heading1">
+    <w:name w:val="heading 1"/>
+    <w:basedOn w:val="Normal"/>
+    <w:next w:val="BodyText"/>
+    <w:link w:val="Heading1Char"/>
+    <w:uiPriority w:val="9"/>
+    <w:qFormat/>
+    <w:rsid w:val="00A10FD9"/>
+    <w:pPr>
+      <w:keepNext/>
+      <w:keepLines/>
+      <w:spacing w:before="360" w:after="80"/>
+      <w:outlineLvl w:val="0"/>
+    </w:pPr>
+    <w:rPr>
+      <w:rFonts w:asciiTheme="majorHAnsi" w:eastAsiaTheme="majorEastAsia" w:hAnsiTheme="majorHAnsi" w:cstheme="majorBidi"/>
+      <w:color w:val="0F4761" w:themeColor="accent1" w:themeShade="BF"/>
+      <w:sz w:val="40"/>
+      <w:szCs w:val="40"/>
+    </w:rPr>
+  </w:style>
+  <w:style w:type="paragraph" w:styleId="Heading2">
+    <w:name w:val="heading 2"/>
+    <w:basedOn w:val="Normal"/>
+    <w:next w:val="BodyText"/>
+    <w:link w:val="Heading2Char"/>
+    <w:uiPriority w:val="9"/>
+    <w:semiHidden/>
+    <w:unhideWhenUsed/>
+    <w:qFormat/>
+    <w:rsid w:val="00A10FD9"/>
+    <w:pPr>
+      <w:keepNext/>
+      <w:keepLines/>
+      <w:spacing w:before="160" w:after="80"/>
+      <w:outlineLvl w:val="1"/>
+    </w:pPr>
+    <w:rPr>
+      <w:rFonts w:asciiTheme="majorHAnsi" w:eastAsiaTheme="majorEastAsia" w:hAnsiTheme="majorHAnsi" w:cstheme="majorBidi"/>
+      <w:color w:val="0F4761" w:themeColor="accent1" w:themeShade="BF"/>
+      <w:sz w:val="32"/>
+      <w:szCs w:val="32"/>
+    </w:rPr>
+  </w:style>
+  <w:style w:type="paragraph" w:styleId="Heading3">
+    <w:name w:val="heading 3"/>
+    <w:basedOn w:val="Normal"/>
+    <w:next w:val="BodyText"/>
+    <w:link w:val="Heading3Char"/>
+    <w:uiPriority w:val="9"/>
+    <w:semiHidden/>
+    <w:unhideWhenUsed/>
+    <w:qFormat/>
+    <w:rsid w:val="00A10FD9"/>
+    <w:pPr>
+      <w:keepNext/>
+      <w:keepLines/>
+      <w:spacing w:before="160" w:after="80"/>
+      <w:outlineLvl w:val="2"/>
+    </w:pPr>
+    <w:rPr>
+      <w:rFonts w:eastAsiaTheme="majorEastAsia" w:cstheme="majorBidi"/>
+      <w:color w:val="0F4761" w:themeColor="accent1" w:themeShade="BF"/>
+      <w:sz w:val="28"/>
+      <w:szCs w:val="28"/>
+    </w:rPr>
+  </w:style>
+  <w:style w:type="paragraph" w:styleId="Heading4">
+    <w:name w:val="heading 4"/>
+    <w:basedOn w:val="Normal"/>
+    <w:next w:val="BodyText"/>
+    <w:link w:val="Heading4Char"/>
+    <w:uiPriority w:val="9"/>
+    <w:semiHidden/>
+    <w:unhideWhenUsed/>
+    <w:qFormat/>
+    <w:rsid w:val="00A10FD9"/>
+    <w:pPr>
+      <w:keepNext/>
+      <w:keepLines/>
+      <w:spacing w:before="80" w:after="40"/>
+      <w:outlineLvl w:val="3"/>
+    </w:pPr>
+    <w:rPr>
+      <w:rFonts w:eastAsiaTheme="majorEastAsia" w:cstheme="majorBidi"/>
+      <w:i/>
+      <w:iCs/>
+      <w:color w:val="0F4761" w:themeColor="accent1" w:themeShade="BF"/>
+    </w:rPr>
+  </w:style>
+  <w:style w:type="paragraph" w:styleId="Heading5">
+    <w:name w:val="heading 5"/>
+    <w:basedOn w:val="Normal"/>
+    <w:next w:val="BodyText"/>
+    <w:link w:val="Heading5Char"/>
+    <w:uiPriority w:val="9"/>
+    <w:semiHidden/>
+    <w:unhideWhenUsed/>
+    <w:qFormat/>
+    <w:rsid w:val="00A10FD9"/>
+    <w:pPr>
+      <w:keepNext/>
+      <w:keepLines/>
+      <w:spacing w:before="80" w:after="40"/>
+      <w:outlineLvl w:val="4"/>
+    </w:pPr>
+    <w:rPr>
+      <w:rFonts w:eastAsiaTheme="majorEastAsia" w:cstheme="majorBidi"/>
+      <w:color w:val="0F4761" w:themeColor="accent1" w:themeShade="BF"/>
+    </w:rPr>
+  </w:style>
+  <w:style w:type="paragraph" w:styleId="Heading6">
+    <w:name w:val="heading 6"/>
+    <w:basedOn w:val="Normal"/>
+    <w:next w:val="BodyText"/>
+    <w:link w:val="Heading6Char"/>
+    <w:uiPriority w:val="9"/>
+    <w:semiHidden/>
+    <w:unhideWhenUsed/>
+    <w:qFormat/>
+    <w:rsid w:val="00A10FD9"/>
+    <w:pPr>
+      <w:keepNext/>
+      <w:keepLines/>
+      <w:spacing w:before="40" w:after="0"/>
+      <w:outlineLvl w:val="5"/>
+    </w:pPr>
+    <w:rPr>
+      <w:rFonts w:eastAsiaTheme="majorEastAsia" w:cstheme="majorBidi"/>
+      <w:i/>
+      <w:iCs/>
+      <w:color w:val="595959" w:themeColor="text1" w:themeTint="A6"/>
+    </w:rPr>
+  </w:style>
+  <w:style w:type="paragraph" w:styleId="Heading7">
+    <w:name w:val="heading 7"/>
+    <w:basedOn w:val="Normal"/>
+    <w:next w:val="BodyText"/>
+    <w:link w:val="Heading7Char"/>
+    <w:uiPriority w:val="9"/>
+    <w:semiHidden/>
+    <w:unhideWhenUsed/>
+    <w:qFormat/>
+    <w:rsid w:val="00A10FD9"/>
+    <w:pPr>
+      <w:keepNext/>
+      <w:keepLines/>
+      <w:spacing w:before="40" w:after="0"/>
+      <w:outlineLvl w:val="6"/>
+    </w:pPr>
+    <w:rPr>
+      <w:rFonts w:eastAsiaTheme="majorEastAsia" w:cstheme="majorBidi"/>
+      <w:color w:val="595959" w:themeColor="text1" w:themeTint="A6"/>
+    </w:rPr>
+  </w:style>
+  <w:style w:type="paragraph" w:styleId="Heading8">
+    <w:name w:val="heading 8"/>
+    <w:basedOn w:val="Normal"/>
+    <w:next w:val="BodyText"/>
+    <w:link w:val="Heading8Char"/>
+    <w:uiPriority w:val="9"/>
+    <w:semiHidden/>
+    <w:unhideWhenUsed/>
+    <w:qFormat/>
+    <w:rsid w:val="00A10FD9"/>
+    <w:pPr>
+      <w:keepNext/>
+      <w:keepLines/>
+      <w:spacing w:after="0"/>
+      <w:outlineLvl w:val="7"/>
+    </w:pPr>
+    <w:rPr>
+      <w:rFonts w:eastAsiaTheme="majorEastAsia" w:cstheme="majorBidi"/>
+      <w:i/>
+      <w:iCs/>
+      <w:color w:val="272727" w:themeColor="text1" w:themeTint="D8"/>
+    </w:rPr>
+  </w:style>
+  <w:style w:type="paragraph" w:styleId="Heading9">
+    <w:name w:val="heading 9"/>
+    <w:basedOn w:val="Normal"/>
+    <w:next w:val="BodyText"/>
+    <w:link w:val="Heading9Char"/>
+    <w:uiPriority w:val="9"/>
+    <w:semiHidden/>
+    <w:unhideWhenUsed/>
+    <w:qFormat/>
+    <w:rsid w:val="00A10FD9"/>
+    <w:pPr>
+      <w:keepNext/>
+      <w:keepLines/>
+      <w:spacing w:after="0"/>
+      <w:outlineLvl w:val="8"/>
+    </w:pPr>
+    <w:rPr>
+      <w:rFonts w:eastAsiaTheme="majorEastAsia" w:cstheme="majorBidi"/>
+      <w:color w:val="272727" w:themeColor="text1" w:themeTint="D8"/>
+    </w:rPr>
+  </w:style>
+  <w:style w:type="character" w:default="1" w:styleId="DefaultParagraphFont">
+    <w:name w:val="Default Paragraph Font"/>
+    <w:uiPriority w:val="1"/>
+    <w:semiHidden/>
+    <w:unhideWhenUsed/>
+  </w:style>
+  <w:style w:type="table" w:default="1" w:styleId="TableNormal">
+    <w:name w:val="Normal Table"/>
+    <w:uiPriority w:val="99"/>
+    <w:semiHidden/>
+    <w:unhideWhenUsed/>
+    <w:tblPr>
+      <w:tblInd w:w="0" w:type="dxa"/>
+      <w:tblCellMar>
+        <w:top w:w="0" w:type="dxa"/>
+        <w:left w:w="108" w:type="dxa"/>
+        <w:bottom w:w="0" w:type="dxa"/>
+        <w:right w:w="108" w:type="dxa"/>
+      </w:tblCellMar>
+    </w:tblPr>
+  </w:style>
+  <w:style w:type="numbering" w:default="1" w:styleId="NoList">
+    <w:name w:val="No List"/>
+    <w:uiPriority w:val="99"/>
+    <w:semiHidden/>
+    <w:unhideWhenUsed/>
+  </w:style>
+  <w:style w:type="paragraph" w:styleId="BodyText">
     <w:name w:val="Body Text"/>
     <w:basedOn w:val="Normal"/>
-    <w:link w:val="BodyTextChar"/>
-    <w:qFormat/>
-    <w:pPr>
-      <w:spacing w:after="180" w:before="180"/>
-    </w:pPr>
-  </w:style>
-  <w:style w:customStyle="1" w:styleId="FirstParagraph" w:type="paragraph">
+    <w:qFormat/>
+    <w:pPr>
+      <w:spacing w:before="180" w:after="180"/>
+    </w:pPr>
+  </w:style>
+  <w:style w:type="paragraph" w:customStyle="1" w:styleId="FirstParagraph">
     <w:name w:val="First Paragraph"/>
     <w:basedOn w:val="BodyText"/>
     <w:next w:val="BodyText"/>
     <w:qFormat/>
   </w:style>
-  <w:style w:customStyle="1" w:styleId="Compact" w:type="paragraph">
+  <w:style w:type="paragraph" w:customStyle="1" w:styleId="Compact">
     <w:name w:val="Compact"/>
     <w:basedOn w:val="BodyText"/>
     <w:qFormat/>
     <w:pPr>
-      <w:spacing w:after="36" w:before="36"/>
-    </w:pPr>
-  </w:style>
-  <w:style w:styleId="Title" w:type="paragraph">
+      <w:spacing w:before="36" w:after="36"/>
+    </w:pPr>
+  </w:style>
+  <w:style w:type="paragraph" w:styleId="Title">
     <w:name w:val="Title"/>
     <w:basedOn w:val="Normal"/>
     <w:next w:val="BodyText"/>
@@ -342,29 +842,29 @@
     <w:qFormat/>
     <w:rsid w:val="00A10FD9"/>
     <w:pPr>
-      <w:spacing w:after="80" w:line="240" w:lineRule="auto"/>
+      <w:spacing w:after="80"/>
       <w:contextualSpacing/>
       <w:jc w:val="center"/>
     </w:pPr>
     <w:rPr>
-      <w:rFonts w:asciiTheme="majorHAnsi" w:cstheme="majorBidi" w:eastAsiaTheme="majorEastAsia" w:hAnsiTheme="majorHAnsi"/>
+      <w:rFonts w:asciiTheme="majorHAnsi" w:eastAsiaTheme="majorEastAsia" w:hAnsiTheme="majorHAnsi" w:cstheme="majorBidi"/>
       <w:sz w:val="56"/>
       <w:szCs w:val="56"/>
     </w:rPr>
   </w:style>
-  <w:style w:customStyle="1" w:styleId="TitleChar" w:type="character">
+  <w:style w:type="character" w:customStyle="1" w:styleId="TitleChar">
     <w:name w:val="Title Char"/>
     <w:basedOn w:val="DefaultParagraphFont"/>
     <w:link w:val="Title"/>
     <w:uiPriority w:val="10"/>
     <w:rsid w:val="00A10FD9"/>
     <w:rPr>
-      <w:rFonts w:asciiTheme="majorHAnsi" w:cstheme="majorBidi" w:eastAsiaTheme="majorEastAsia" w:hAnsiTheme="majorHAnsi"/>
+      <w:rFonts w:asciiTheme="majorHAnsi" w:eastAsiaTheme="majorEastAsia" w:hAnsiTheme="majorHAnsi" w:cstheme="majorBidi"/>
       <w:sz w:val="56"/>
       <w:szCs w:val="56"/>
     </w:rPr>
   </w:style>
-  <w:style w:styleId="Subtitle" w:type="paragraph">
+  <w:style w:type="paragraph" w:styleId="Subtitle">
     <w:name w:val="Subtitle"/>
     <w:basedOn w:val="Title"/>
     <w:next w:val="BodyText"/>
@@ -378,27 +878,26 @@
       </w:numPr>
     </w:pPr>
     <w:rPr>
-      <w:rFonts w:cstheme="majorBidi" w:eastAsiaTheme="majorEastAsia"/>
       <w:spacing w:val="15"/>
       <w:sz w:val="28"/>
       <w:szCs w:val="28"/>
     </w:rPr>
   </w:style>
-  <w:style w:customStyle="1" w:styleId="SubtitleChar" w:type="character">
+  <w:style w:type="character" w:customStyle="1" w:styleId="SubtitleChar">
     <w:name w:val="Subtitle Char"/>
     <w:basedOn w:val="DefaultParagraphFont"/>
     <w:link w:val="Subtitle"/>
     <w:uiPriority w:val="11"/>
     <w:rsid w:val="00A10FD9"/>
     <w:rPr>
-      <w:rFonts w:cstheme="majorBidi" w:eastAsiaTheme="majorEastAsia"/>
-      <w:color w:themeColor="text1" w:themeTint="A6" w:val="595959"/>
+      <w:rFonts w:eastAsiaTheme="majorEastAsia" w:cstheme="majorBidi"/>
+      <w:color w:val="595959" w:themeColor="text1" w:themeTint="A6"/>
       <w:spacing w:val="15"/>
       <w:sz w:val="28"/>
       <w:szCs w:val="28"/>
     </w:rPr>
   </w:style>
-  <w:style w:customStyle="1" w:styleId="Author" w:type="paragraph">
+  <w:style w:type="paragraph" w:customStyle="1" w:styleId="Author">
     <w:name w:val="Author"/>
     <w:basedOn w:val="Title"/>
     <w:next w:val="BodyText"/>
@@ -412,7 +911,7 @@
       <w:szCs w:val="24"/>
     </w:rPr>
   </w:style>
-  <w:style w:styleId="Date" w:type="paragraph">
+  <w:style w:type="paragraph" w:styleId="Date">
     <w:name w:val="Date"/>
     <w:basedOn w:val="Title"/>
     <w:next w:val="BodyText"/>
@@ -426,7 +925,7 @@
       <w:szCs w:val="24"/>
     </w:rPr>
   </w:style>
-  <w:style w:customStyle="1" w:styleId="AbstractTitle" w:type="paragraph">
+  <w:style w:type="paragraph" w:customStyle="1" w:styleId="AbstractTitle">
     <w:name w:val="Abstract Title"/>
     <w:basedOn w:val="Normal"/>
     <w:next w:val="Abstract"/>
@@ -434,7 +933,7 @@
     <w:pPr>
       <w:keepNext/>
       <w:keepLines/>
-      <w:spacing w:after="0" w:before="300"/>
+      <w:spacing w:before="300" w:after="0"/>
       <w:jc w:val="center"/>
     </w:pPr>
     <w:rPr>
@@ -443,7 +942,7 @@
       <w:szCs w:val="20"/>
     </w:rPr>
   </w:style>
-  <w:style w:customStyle="1" w:styleId="Abstract" w:type="paragraph">
+  <w:style w:type="paragraph" w:customStyle="1" w:styleId="Abstract">
     <w:name w:val="Abstract"/>
     <w:basedOn w:val="Normal"/>
     <w:next w:val="BodyText"/>
@@ -451,234 +950,32 @@
     <w:pPr>
       <w:keepNext/>
       <w:keepLines/>
-      <w:spacing w:after="300" w:before="100"/>
+      <w:spacing w:before="100" w:after="300"/>
     </w:pPr>
     <w:rPr>
       <w:sz w:val="20"/>
       <w:szCs w:val="20"/>
     </w:rPr>
   </w:style>
-  <w:style w:styleId="Bibliography" w:type="paragraph">
+  <w:style w:type="paragraph" w:styleId="Bibliography">
     <w:name w:val="Bibliography"/>
     <w:basedOn w:val="Normal"/>
-    <w:next w:val="Bibliography"/>
-    <w:qFormat/>
-    <w:pPr/>
-    <w:rPr/>
-  </w:style>
-  <w:style w:styleId="Heading1" w:type="paragraph">
-    <w:name w:val="heading 1"/>
-    <w:basedOn w:val="Normal"/>
-    <w:next w:val="BodyText"/>
-    <w:link w:val="Heading1Char"/>
-    <w:uiPriority w:val="9"/>
-    <w:qFormat/>
-    <w:rsid w:val="00A10FD9"/>
-    <w:pPr>
-      <w:keepNext/>
-      <w:keepLines/>
-      <w:spacing w:after="80" w:before="360"/>
-      <w:outlineLvl w:val="0"/>
-    </w:pPr>
-    <w:rPr>
-      <w:rFonts w:asciiTheme="majorHAnsi" w:cstheme="majorBidi" w:eastAsiaTheme="majorEastAsia" w:hAnsiTheme="majorHAnsi"/>
-      <w:color w:themeColor="accent1" w:themeShade="BF" w:val="0F4761"/>
-      <w:sz w:val="40"/>
-      <w:szCs w:val="40"/>
-    </w:rPr>
-  </w:style>
-  <w:style w:styleId="Heading2" w:type="paragraph">
-    <w:name w:val="heading 2"/>
-    <w:basedOn w:val="Normal"/>
-    <w:next w:val="BodyText"/>
-    <w:link w:val="Heading2Char"/>
-    <w:uiPriority w:val="9"/>
-    <w:semiHidden/>
-    <w:unhideWhenUsed/>
-    <w:qFormat/>
-    <w:rsid w:val="00A10FD9"/>
-    <w:pPr>
-      <w:keepNext/>
-      <w:keepLines/>
-      <w:spacing w:after="80" w:before="160"/>
-      <w:outlineLvl w:val="1"/>
-    </w:pPr>
-    <w:rPr>
-      <w:rFonts w:asciiTheme="majorHAnsi" w:cstheme="majorBidi" w:eastAsiaTheme="majorEastAsia" w:hAnsiTheme="majorHAnsi"/>
-      <w:color w:themeColor="accent1" w:themeShade="BF" w:val="0F4761"/>
-      <w:sz w:val="32"/>
-      <w:szCs w:val="32"/>
-    </w:rPr>
-  </w:style>
-  <w:style w:styleId="Heading3" w:type="paragraph">
-    <w:name w:val="heading 3"/>
-    <w:basedOn w:val="Normal"/>
-    <w:next w:val="BodyText"/>
-    <w:link w:val="Heading3Char"/>
-    <w:uiPriority w:val="9"/>
-    <w:semiHidden/>
-    <w:unhideWhenUsed/>
-    <w:qFormat/>
-    <w:rsid w:val="00A10FD9"/>
-    <w:pPr>
-      <w:keepNext/>
-      <w:keepLines/>
-      <w:spacing w:after="80" w:before="160"/>
-      <w:outlineLvl w:val="2"/>
-    </w:pPr>
-    <w:rPr>
-      <w:rFonts w:cstheme="majorBidi" w:eastAsiaTheme="majorEastAsia"/>
-      <w:color w:themeColor="accent1" w:themeShade="BF" w:val="0F4761"/>
-      <w:sz w:val="28"/>
-      <w:szCs w:val="28"/>
-    </w:rPr>
-  </w:style>
-  <w:style w:styleId="Heading4" w:type="paragraph">
-    <w:name w:val="heading 4"/>
-    <w:basedOn w:val="Normal"/>
-    <w:next w:val="BodyText"/>
-    <w:link w:val="Heading4Char"/>
-    <w:uiPriority w:val="9"/>
-    <w:semiHidden/>
-    <w:unhideWhenUsed/>
-    <w:qFormat/>
-    <w:rsid w:val="00A10FD9"/>
-    <w:pPr>
-      <w:keepNext/>
-      <w:keepLines/>
-      <w:spacing w:after="40" w:before="80"/>
-      <w:outlineLvl w:val="3"/>
-    </w:pPr>
-    <w:rPr>
-      <w:rFonts w:cstheme="majorBidi" w:eastAsiaTheme="majorEastAsia"/>
-      <w:i/>
-      <w:iCs/>
-      <w:color w:themeColor="accent1" w:themeShade="BF" w:val="0F4761"/>
-    </w:rPr>
-  </w:style>
-  <w:style w:styleId="Heading5" w:type="paragraph">
-    <w:name w:val="heading 5"/>
-    <w:basedOn w:val="Normal"/>
-    <w:next w:val="BodyText"/>
-    <w:link w:val="Heading5Char"/>
-    <w:uiPriority w:val="9"/>
-    <w:semiHidden/>
-    <w:unhideWhenUsed/>
-    <w:qFormat/>
-    <w:rsid w:val="00A10FD9"/>
-    <w:pPr>
-      <w:keepNext/>
-      <w:keepLines/>
-      <w:spacing w:after="40" w:before="80"/>
-      <w:outlineLvl w:val="4"/>
-    </w:pPr>
-    <w:rPr>
-      <w:rFonts w:cstheme="majorBidi" w:eastAsiaTheme="majorEastAsia"/>
-      <w:color w:themeColor="accent1" w:themeShade="BF" w:val="0F4761"/>
-    </w:rPr>
-  </w:style>
-  <w:style w:styleId="Heading6" w:type="paragraph">
-    <w:name w:val="heading 6"/>
-    <w:basedOn w:val="Normal"/>
-    <w:next w:val="BodyText"/>
-    <w:link w:val="Heading6Char"/>
-    <w:uiPriority w:val="9"/>
-    <w:semiHidden/>
-    <w:unhideWhenUsed/>
-    <w:qFormat/>
-    <w:rsid w:val="00A10FD9"/>
-    <w:pPr>
-      <w:keepNext/>
-      <w:keepLines/>
-      <w:spacing w:after="0" w:before="40"/>
-      <w:outlineLvl w:val="5"/>
-    </w:pPr>
-    <w:rPr>
-      <w:rFonts w:cstheme="majorBidi" w:eastAsiaTheme="majorEastAsia"/>
-      <w:i/>
-      <w:iCs/>
-      <w:color w:themeColor="text1" w:themeTint="A6" w:val="595959"/>
-    </w:rPr>
-  </w:style>
-  <w:style w:styleId="Heading7" w:type="paragraph">
-    <w:name w:val="heading 7"/>
-    <w:basedOn w:val="Normal"/>
-    <w:next w:val="BodyText"/>
-    <w:link w:val="Heading7Char"/>
-    <w:uiPriority w:val="9"/>
-    <w:semiHidden/>
-    <w:unhideWhenUsed/>
-    <w:qFormat/>
-    <w:rsid w:val="00A10FD9"/>
-    <w:pPr>
-      <w:keepNext/>
-      <w:keepLines/>
-      <w:spacing w:after="0" w:before="40"/>
-      <w:outlineLvl w:val="6"/>
-    </w:pPr>
-    <w:rPr>
-      <w:rFonts w:cstheme="majorBidi" w:eastAsiaTheme="majorEastAsia"/>
-      <w:color w:themeColor="text1" w:themeTint="A6" w:val="595959"/>
-    </w:rPr>
-  </w:style>
-  <w:style w:styleId="Heading8" w:type="paragraph">
-    <w:name w:val="heading 8"/>
-    <w:basedOn w:val="Normal"/>
-    <w:next w:val="BodyText"/>
-    <w:link w:val="Heading8Char"/>
-    <w:uiPriority w:val="9"/>
-    <w:semiHidden/>
-    <w:unhideWhenUsed/>
-    <w:qFormat/>
-    <w:rsid w:val="00A10FD9"/>
-    <w:pPr>
-      <w:keepNext/>
-      <w:keepLines/>
-      <w:spacing w:after="0"/>
-      <w:outlineLvl w:val="7"/>
-    </w:pPr>
-    <w:rPr>
-      <w:rFonts w:cstheme="majorBidi" w:eastAsiaTheme="majorEastAsia"/>
-      <w:i/>
-      <w:iCs/>
-      <w:color w:themeColor="text1" w:themeTint="D8" w:val="272727"/>
-    </w:rPr>
-  </w:style>
-  <w:style w:styleId="Heading9" w:type="paragraph">
-    <w:name w:val="heading 9"/>
-    <w:basedOn w:val="Normal"/>
-    <w:next w:val="BodyText"/>
-    <w:link w:val="Heading9Char"/>
-    <w:uiPriority w:val="9"/>
-    <w:semiHidden/>
-    <w:unhideWhenUsed/>
-    <w:qFormat/>
-    <w:rsid w:val="00A10FD9"/>
-    <w:pPr>
-      <w:keepNext/>
-      <w:keepLines/>
-      <w:spacing w:after="0"/>
-      <w:outlineLvl w:val="8"/>
-    </w:pPr>
-    <w:rPr>
-      <w:rFonts w:cstheme="majorBidi" w:eastAsiaTheme="majorEastAsia"/>
-      <w:color w:themeColor="text1" w:themeTint="D8" w:val="272727"/>
-    </w:rPr>
-  </w:style>
-  <w:style w:customStyle="1" w:styleId="Heading1Char" w:type="character">
+    <w:qFormat/>
+  </w:style>
+  <w:style w:type="character" w:customStyle="1" w:styleId="Heading1Char">
     <w:name w:val="Heading 1 Char"/>
     <w:basedOn w:val="DefaultParagraphFont"/>
     <w:link w:val="Heading1"/>
     <w:uiPriority w:val="9"/>
     <w:rsid w:val="00A10FD9"/>
     <w:rPr>
-      <w:rFonts w:asciiTheme="majorHAnsi" w:cstheme="majorBidi" w:eastAsiaTheme="majorEastAsia" w:hAnsiTheme="majorHAnsi"/>
-      <w:color w:themeColor="accent1" w:themeShade="BF" w:val="0F4761"/>
+      <w:rFonts w:asciiTheme="majorHAnsi" w:eastAsiaTheme="majorEastAsia" w:hAnsiTheme="majorHAnsi" w:cstheme="majorBidi"/>
+      <w:color w:val="0F4761" w:themeColor="accent1" w:themeShade="BF"/>
       <w:sz w:val="40"/>
       <w:szCs w:val="40"/>
     </w:rPr>
   </w:style>
-  <w:style w:customStyle="1" w:styleId="Heading2Char" w:type="character">
+  <w:style w:type="character" w:customStyle="1" w:styleId="Heading2Char">
     <w:name w:val="Heading 2 Char"/>
     <w:basedOn w:val="DefaultParagraphFont"/>
     <w:link w:val="Heading2"/>
@@ -686,13 +983,13 @@
     <w:semiHidden/>
     <w:rsid w:val="00A10FD9"/>
     <w:rPr>
-      <w:rFonts w:asciiTheme="majorHAnsi" w:cstheme="majorBidi" w:eastAsiaTheme="majorEastAsia" w:hAnsiTheme="majorHAnsi"/>
-      <w:color w:themeColor="accent1" w:themeShade="BF" w:val="0F4761"/>
+      <w:rFonts w:asciiTheme="majorHAnsi" w:eastAsiaTheme="majorEastAsia" w:hAnsiTheme="majorHAnsi" w:cstheme="majorBidi"/>
+      <w:color w:val="0F4761" w:themeColor="accent1" w:themeShade="BF"/>
       <w:sz w:val="32"/>
       <w:szCs w:val="32"/>
     </w:rPr>
   </w:style>
-  <w:style w:customStyle="1" w:styleId="Heading3Char" w:type="character">
+  <w:style w:type="character" w:customStyle="1" w:styleId="Heading3Char">
     <w:name w:val="Heading 3 Char"/>
     <w:basedOn w:val="DefaultParagraphFont"/>
     <w:link w:val="Heading3"/>
@@ -700,13 +997,13 @@
     <w:semiHidden/>
     <w:rsid w:val="00A10FD9"/>
     <w:rPr>
-      <w:rFonts w:cstheme="majorBidi" w:eastAsiaTheme="majorEastAsia"/>
-      <w:color w:themeColor="accent1" w:themeShade="BF" w:val="0F4761"/>
+      <w:rFonts w:eastAsiaTheme="majorEastAsia" w:cstheme="majorBidi"/>
+      <w:color w:val="0F4761" w:themeColor="accent1" w:themeShade="BF"/>
       <w:sz w:val="28"/>
       <w:szCs w:val="28"/>
     </w:rPr>
   </w:style>
-  <w:style w:customStyle="1" w:styleId="Heading4Char" w:type="character">
+  <w:style w:type="character" w:customStyle="1" w:styleId="Heading4Char">
     <w:name w:val="Heading 4 Char"/>
     <w:basedOn w:val="DefaultParagraphFont"/>
     <w:link w:val="Heading4"/>
@@ -714,13 +1011,13 @@
     <w:semiHidden/>
     <w:rsid w:val="00A10FD9"/>
     <w:rPr>
-      <w:rFonts w:cstheme="majorBidi" w:eastAsiaTheme="majorEastAsia"/>
+      <w:rFonts w:eastAsiaTheme="majorEastAsia" w:cstheme="majorBidi"/>
       <w:i/>
       <w:iCs/>
-      <w:color w:themeColor="accent1" w:themeShade="BF" w:val="0F4761"/>
-    </w:rPr>
-  </w:style>
-  <w:style w:customStyle="1" w:styleId="Heading5Char" w:type="character">
+      <w:color w:val="0F4761" w:themeColor="accent1" w:themeShade="BF"/>
+    </w:rPr>
+  </w:style>
+  <w:style w:type="character" w:customStyle="1" w:styleId="Heading5Char">
     <w:name w:val="Heading 5 Char"/>
     <w:basedOn w:val="DefaultParagraphFont"/>
     <w:link w:val="Heading5"/>
@@ -728,11 +1025,11 @@
     <w:semiHidden/>
     <w:rsid w:val="00A10FD9"/>
     <w:rPr>
-      <w:rFonts w:cstheme="majorBidi" w:eastAsiaTheme="majorEastAsia"/>
-      <w:color w:themeColor="accent1" w:themeShade="BF" w:val="0F4761"/>
-    </w:rPr>
-  </w:style>
-  <w:style w:customStyle="1" w:styleId="Heading6Char" w:type="character">
+      <w:rFonts w:eastAsiaTheme="majorEastAsia" w:cstheme="majorBidi"/>
+      <w:color w:val="0F4761" w:themeColor="accent1" w:themeShade="BF"/>
+    </w:rPr>
+  </w:style>
+  <w:style w:type="character" w:customStyle="1" w:styleId="Heading6Char">
     <w:name w:val="Heading 6 Char"/>
     <w:basedOn w:val="DefaultParagraphFont"/>
     <w:link w:val="Heading6"/>
@@ -740,13 +1037,13 @@
     <w:semiHidden/>
     <w:rsid w:val="00A10FD9"/>
     <w:rPr>
-      <w:rFonts w:cstheme="majorBidi" w:eastAsiaTheme="majorEastAsia"/>
+      <w:rFonts w:eastAsiaTheme="majorEastAsia" w:cstheme="majorBidi"/>
       <w:i/>
       <w:iCs/>
-      <w:color w:themeColor="text1" w:themeTint="A6" w:val="595959"/>
-    </w:rPr>
-  </w:style>
-  <w:style w:customStyle="1" w:styleId="Heading7Char" w:type="character">
+      <w:color w:val="595959" w:themeColor="text1" w:themeTint="A6"/>
+    </w:rPr>
+  </w:style>
+  <w:style w:type="character" w:customStyle="1" w:styleId="Heading7Char">
     <w:name w:val="Heading 7 Char"/>
     <w:basedOn w:val="DefaultParagraphFont"/>
     <w:link w:val="Heading7"/>
@@ -754,11 +1051,11 @@
     <w:semiHidden/>
     <w:rsid w:val="00A10FD9"/>
     <w:rPr>
-      <w:rFonts w:cstheme="majorBidi" w:eastAsiaTheme="majorEastAsia"/>
-      <w:color w:themeColor="text1" w:themeTint="A6" w:val="595959"/>
-    </w:rPr>
-  </w:style>
-  <w:style w:customStyle="1" w:styleId="Heading8Char" w:type="character">
+      <w:rFonts w:eastAsiaTheme="majorEastAsia" w:cstheme="majorBidi"/>
+      <w:color w:val="595959" w:themeColor="text1" w:themeTint="A6"/>
+    </w:rPr>
+  </w:style>
+  <w:style w:type="character" w:customStyle="1" w:styleId="Heading8Char">
     <w:name w:val="Heading 8 Char"/>
     <w:basedOn w:val="DefaultParagraphFont"/>
     <w:link w:val="Heading8"/>
@@ -766,13 +1063,13 @@
     <w:semiHidden/>
     <w:rsid w:val="00A10FD9"/>
     <w:rPr>
-      <w:rFonts w:cstheme="majorBidi" w:eastAsiaTheme="majorEastAsia"/>
+      <w:rFonts w:eastAsiaTheme="majorEastAsia" w:cstheme="majorBidi"/>
       <w:i/>
       <w:iCs/>
-      <w:color w:themeColor="text1" w:themeTint="D8" w:val="272727"/>
-    </w:rPr>
-  </w:style>
-  <w:style w:customStyle="1" w:styleId="Heading9Char" w:type="character">
+      <w:color w:val="272727" w:themeColor="text1" w:themeTint="D8"/>
+    </w:rPr>
+  </w:style>
+  <w:style w:type="character" w:customStyle="1" w:styleId="Heading9Char">
     <w:name w:val="Heading 9 Char"/>
     <w:basedOn w:val="DefaultParagraphFont"/>
     <w:link w:val="Heading9"/>
@@ -780,11 +1077,11 @@
     <w:semiHidden/>
     <w:rsid w:val="00A10FD9"/>
     <w:rPr>
-      <w:rFonts w:cstheme="majorBidi" w:eastAsiaTheme="majorEastAsia"/>
-      <w:color w:themeColor="text1" w:themeTint="D8" w:val="272727"/>
-    </w:rPr>
-  </w:style>
-  <w:style w:styleId="BlockText" w:type="paragraph">
+      <w:rFonts w:eastAsiaTheme="majorEastAsia" w:cstheme="majorBidi"/>
+      <w:color w:val="272727" w:themeColor="text1" w:themeTint="D8"/>
+    </w:rPr>
+  </w:style>
+  <w:style w:type="paragraph" w:styleId="BlockText">
     <w:name w:val="Block Text"/>
     <w:basedOn w:val="BodyText"/>
     <w:next w:val="BodyText"/>
@@ -792,19 +1089,18 @@
     <w:unhideWhenUsed/>
     <w:qFormat/>
     <w:pPr>
-      <w:spacing w:after="100" w:before="100"/>
-      <w:ind w:firstLine="0" w:left="480" w:right="480"/>
-    </w:pPr>
-  </w:style>
-  <w:style w:styleId="FootnoteText" w:type="paragraph">
-    <w:name w:val="Footnote Text"/>
-    <w:basedOn w:val="Normal"/>
-    <w:next w:val="FootnoteText"/>
+      <w:spacing w:before="100" w:after="100"/>
+      <w:ind w:left="480" w:right="480"/>
+    </w:pPr>
+  </w:style>
+  <w:style w:type="paragraph" w:styleId="FootnoteText">
+    <w:name w:val="footnote text"/>
+    <w:basedOn w:val="Normal"/>
     <w:uiPriority w:val="9"/>
     <w:unhideWhenUsed/>
     <w:qFormat/>
   </w:style>
-  <w:style w:styleId="FootnoteBlockText" w:type="paragraph">
+  <w:style w:type="paragraph" w:customStyle="1" w:styleId="FootnoteBlockText">
     <w:name w:val="Footnote Block Text"/>
     <w:basedOn w:val="FootnoteText"/>
     <w:next w:val="FootnoteText"/>
@@ -812,40 +1108,35 @@
     <w:unhideWhenUsed/>
     <w:qFormat/>
     <w:pPr>
-      <w:spacing w:after="100" w:before="100"/>
-      <w:ind w:firstLine="0" w:left="480" w:right="480"/>
-    </w:pPr>
-  </w:style>
-  <w:style w:default="1" w:styleId="DefaultParagraphFont" w:type="character">
-    <w:name w:val="Default Paragraph Font"/>
+      <w:spacing w:before="100" w:after="100"/>
+      <w:ind w:left="480" w:right="480"/>
+    </w:pPr>
+  </w:style>
+  <w:style w:type="table" w:customStyle="1" w:styleId="Table">
+    <w:name w:val="Table"/>
     <w:semiHidden/>
     <w:unhideWhenUsed/>
-  </w:style>
-  <w:style w:default="1" w:styleId="Table" w:type="table">
-    <w:name w:val="Table"/>
-    <w:basedOn w:val="TableNormal"/>
-    <w:semiHidden/>
-    <w:unhideWhenUsed/>
     <w:qFormat/>
     <w:tblPr>
-      <w:tblInd w:type="dxa" w:w="0"/>
+      <w:tblInd w:w="0" w:type="dxa"/>
       <w:tblCellMar>
-        <w:top w:type="dxa" w:w="0"/>
-        <w:left w:type="dxa" w:w="108"/>
-        <w:bottom w:type="dxa" w:w="0"/>
-        <w:right w:type="dxa" w:w="108"/>
+        <w:top w:w="0" w:type="dxa"/>
+        <w:left w:w="108" w:type="dxa"/>
+        <w:bottom w:w="0" w:type="dxa"/>
+        <w:right w:w="108" w:type="dxa"/>
       </w:tblCellMar>
     </w:tblPr>
     <w:tblStylePr w:type="firstRow">
+      <w:tblPr/>
       <w:tcPr>
         <w:tcBorders>
-          <w:bottom w:val="single"/>
+          <w:bottom w:val="single" w:sz="0" w:space="0" w:color="auto"/>
         </w:tcBorders>
         <w:vAlign w:val="bottom"/>
       </w:tcPr>
     </w:tblStylePr>
   </w:style>
-  <w:style w:customStyle="1" w:styleId="DefinitionTerm" w:type="paragraph">
+  <w:style w:type="paragraph" w:customStyle="1" w:styleId="DefinitionTerm">
     <w:name w:val="Definition Term"/>
     <w:basedOn w:val="Normal"/>
     <w:next w:val="Definition"/>
@@ -858,75 +1149,76 @@
       <w:b/>
     </w:rPr>
   </w:style>
-  <w:style w:customStyle="1" w:styleId="Definition" w:type="paragraph">
+  <w:style w:type="paragraph" w:customStyle="1" w:styleId="Definition">
     <w:name w:val="Definition"/>
     <w:basedOn w:val="Normal"/>
   </w:style>
-  <w:style w:styleId="Caption" w:type="paragraph">
-    <w:name w:val="Caption"/>
-    <w:basedOn w:val="Normal"/>
-    <w:link w:val="BodyTextChar"/>
-    <w:pPr>
-      <w:spacing w:after="120" w:before="0"/>
+  <w:style w:type="paragraph" w:styleId="Caption">
+    <w:name w:val="caption"/>
+    <w:basedOn w:val="Normal"/>
+    <w:link w:val="CaptionChar"/>
+    <w:pPr>
+      <w:spacing w:after="120"/>
     </w:pPr>
     <w:rPr>
       <w:i/>
     </w:rPr>
   </w:style>
-  <w:style w:customStyle="1" w:styleId="TableCaption" w:type="paragraph">
+  <w:style w:type="paragraph" w:customStyle="1" w:styleId="TableCaption">
     <w:name w:val="Table Caption"/>
     <w:basedOn w:val="Caption"/>
     <w:pPr>
       <w:keepNext/>
     </w:pPr>
   </w:style>
-  <w:style w:customStyle="1" w:styleId="ImageCaption" w:type="paragraph">
+  <w:style w:type="paragraph" w:customStyle="1" w:styleId="ImageCaption">
     <w:name w:val="Image Caption"/>
     <w:basedOn w:val="Caption"/>
   </w:style>
-  <w:style w:customStyle="1" w:styleId="Figure" w:type="paragraph">
+  <w:style w:type="paragraph" w:customStyle="1" w:styleId="Figure">
     <w:name w:val="Figure"/>
     <w:basedOn w:val="Normal"/>
   </w:style>
-  <w:style w:customStyle="1" w:styleId="CaptionedFigure" w:type="paragraph">
+  <w:style w:type="paragraph" w:customStyle="1" w:styleId="CaptionedFigure">
     <w:name w:val="Captioned Figure"/>
     <w:basedOn w:val="Figure"/>
     <w:pPr>
       <w:keepNext/>
     </w:pPr>
   </w:style>
-  <w:style w:customStyle="1" w:styleId="BodyTextChar" w:type="character">
-    <w:name w:val="Body Text Char"/>
+  <w:style w:type="character" w:customStyle="1" w:styleId="CaptionChar">
+    <w:name w:val="Caption Char"/>
     <w:basedOn w:val="DefaultParagraphFont"/>
-    <w:link w:val="BodyText"/>
-  </w:style>
-  <w:style w:customStyle="1" w:styleId="VerbatimChar" w:type="character">
+    <w:link w:val="Caption"/>
+  </w:style>
+  <w:style w:type="character" w:customStyle="1" w:styleId="VerbatimChar">
     <w:name w:val="Verbatim Char"/>
-    <w:basedOn w:val="BodyTextChar"/>
-    <w:rPr>
-      <w:rFonts w:ascii="Consolas" w:hAnsi="Consolas"/>
-      <w:sz w:val="22"/>
-    </w:rPr>
-  </w:style>
-  <w:style w:customStyle="1" w:styleId="SectionNumber" w:type="character">
+    <w:basedOn w:val="CaptionChar"/>
+    <w:link w:val="SourceCode"/>
+    <w:rPr>
+      <w:rFonts w:ascii="Consolas" w:hAnsi="Consolas"/>
+      <w:sz w:val="22"/>
+    </w:rPr>
+  </w:style>
+  <w:style w:type="character" w:customStyle="1" w:styleId="SectionNumber">
     <w:name w:val="Section Number"/>
-    <w:basedOn w:val="BodyTextChar"/>
-  </w:style>
-  <w:style w:styleId="FootnoteReference" w:type="character">
-    <w:name w:val="Footnote Reference"/>
-    <w:basedOn w:val="BodyTextChar"/>
+    <w:basedOn w:val="CaptionChar"/>
+  </w:style>
+  <w:style w:type="character" w:styleId="FootnoteReference">
+    <w:name w:val="footnote reference"/>
+    <w:basedOn w:val="CaptionChar"/>
     <w:rPr>
       <w:vertAlign w:val="superscript"/>
     </w:rPr>
   </w:style>
-  <w:style w:styleId="Hyperlink" w:type="character">
+  <w:style w:type="character" w:styleId="Hyperlink">
     <w:name w:val="Hyperlink"/>
-    <w:basedOn w:val="BodyTextChar"/>
-    <w:rPr>
-      <w:color w:themeColor="accent1" w:val="4F81BD"/>
-    </w:rPr>
-  </w:style>
-  <w:style w:styleId="TOCHeading" w:type="paragraph">
+    <w:basedOn w:val="CaptionChar"/>
+    <w:rPr>
+      <w:color w:val="156082" w:themeColor="accent1"/>
+    </w:rPr>
+  </w:style>
+  <w:style w:type="paragraph" w:styleId="TOCHeading">
     <w:name w:val="TOC Heading"/>
     <w:basedOn w:val="Heading1"/>
     <w:next w:val="BodyText"/>
@@ -937,246 +1229,305 @@
       <w:spacing w:before="240" w:line="259" w:lineRule="auto"/>
       <w:outlineLvl w:val="9"/>
     </w:pPr>
-    <w:rPr>
-      <w:rFonts w:asciiTheme="majorHAnsi" w:cstheme="majorBidi" w:eastAsiaTheme="majorEastAsia" w:hAnsiTheme="majorHAnsi"/>
-      <w:b w:val="0"/>
-      <w:bCs w:val="0"/>
-      <w:color w:themeColor="accent1" w:themeShade="BF" w:val="365F91"/>
-    </w:rPr>
   </w:style>
   <w:style w:type="paragraph" w:customStyle="1" w:styleId="SourceCode">
     <w:name w:val="Source Code"/>
     <w:basedOn w:val="Normal"/>
     <w:link w:val="VerbatimChar"/>
     <w:pPr>
-      <w:wordWrap w:val="off"/>
+      <w:wordWrap w:val="0"/>
     </w:pPr>
   </w:style>
   <w:style w:type="character" w:customStyle="1" w:styleId="KeywordTok">
     <w:name w:val="KeywordTok"/>
     <w:basedOn w:val="VerbatimChar"/>
     <w:rPr>
+      <w:rFonts w:ascii="Consolas" w:hAnsi="Consolas"/>
       <w:b/>
       <w:color w:val="007020"/>
+      <w:sz w:val="22"/>
     </w:rPr>
   </w:style>
   <w:style w:type="character" w:customStyle="1" w:styleId="DataTypeTok">
     <w:name w:val="DataTypeTok"/>
     <w:basedOn w:val="VerbatimChar"/>
     <w:rPr>
+      <w:rFonts w:ascii="Consolas" w:hAnsi="Consolas"/>
       <w:color w:val="902000"/>
+      <w:sz w:val="22"/>
     </w:rPr>
   </w:style>
   <w:style w:type="character" w:customStyle="1" w:styleId="DecValTok">
     <w:name w:val="DecValTok"/>
     <w:basedOn w:val="VerbatimChar"/>
     <w:rPr>
-      <w:color w:val="40a070"/>
+      <w:rFonts w:ascii="Consolas" w:hAnsi="Consolas"/>
+      <w:color w:val="40A070"/>
+      <w:sz w:val="22"/>
     </w:rPr>
   </w:style>
   <w:style w:type="character" w:customStyle="1" w:styleId="BaseNTok">
     <w:name w:val="BaseNTok"/>
     <w:basedOn w:val="VerbatimChar"/>
     <w:rPr>
-      <w:color w:val="40a070"/>
+      <w:rFonts w:ascii="Consolas" w:hAnsi="Consolas"/>
+      <w:color w:val="40A070"/>
+      <w:sz w:val="22"/>
     </w:rPr>
   </w:style>
   <w:style w:type="character" w:customStyle="1" w:styleId="FloatTok">
     <w:name w:val="FloatTok"/>
     <w:basedOn w:val="VerbatimChar"/>
     <w:rPr>
-      <w:color w:val="40a070"/>
+      <w:rFonts w:ascii="Consolas" w:hAnsi="Consolas"/>
+      <w:color w:val="40A070"/>
+      <w:sz w:val="22"/>
     </w:rPr>
   </w:style>
   <w:style w:type="character" w:customStyle="1" w:styleId="ConstantTok">
     <w:name w:val="ConstantTok"/>
     <w:basedOn w:val="VerbatimChar"/>
     <w:rPr>
+      <w:rFonts w:ascii="Consolas" w:hAnsi="Consolas"/>
       <w:color w:val="880000"/>
+      <w:sz w:val="22"/>
     </w:rPr>
   </w:style>
   <w:style w:type="character" w:customStyle="1" w:styleId="CharTok">
     <w:name w:val="CharTok"/>
     <w:basedOn w:val="VerbatimChar"/>
     <w:rPr>
-      <w:color w:val="4070a0"/>
+      <w:rFonts w:ascii="Consolas" w:hAnsi="Consolas"/>
+      <w:color w:val="4070A0"/>
+      <w:sz w:val="22"/>
     </w:rPr>
   </w:style>
   <w:style w:type="character" w:customStyle="1" w:styleId="SpecialCharTok">
     <w:name w:val="SpecialCharTok"/>
     <w:basedOn w:val="VerbatimChar"/>
     <w:rPr>
-      <w:color w:val="4070a0"/>
+      <w:rFonts w:ascii="Consolas" w:hAnsi="Consolas"/>
+      <w:color w:val="4070A0"/>
+      <w:sz w:val="22"/>
     </w:rPr>
   </w:style>
   <w:style w:type="character" w:customStyle="1" w:styleId="StringTok">
     <w:name w:val="StringTok"/>
     <w:basedOn w:val="VerbatimChar"/>
     <w:rPr>
-      <w:color w:val="4070a0"/>
+      <w:rFonts w:ascii="Consolas" w:hAnsi="Consolas"/>
+      <w:color w:val="4070A0"/>
+      <w:sz w:val="22"/>
     </w:rPr>
   </w:style>
   <w:style w:type="character" w:customStyle="1" w:styleId="VerbatimStringTok">
     <w:name w:val="VerbatimStringTok"/>
     <w:basedOn w:val="VerbatimChar"/>
     <w:rPr>
-      <w:color w:val="4070a0"/>
+      <w:rFonts w:ascii="Consolas" w:hAnsi="Consolas"/>
+      <w:color w:val="4070A0"/>
+      <w:sz w:val="22"/>
     </w:rPr>
   </w:style>
   <w:style w:type="character" w:customStyle="1" w:styleId="SpecialStringTok">
     <w:name w:val="SpecialStringTok"/>
     <w:basedOn w:val="VerbatimChar"/>
     <w:rPr>
-      <w:color w:val="bb6688"/>
+      <w:rFonts w:ascii="Consolas" w:hAnsi="Consolas"/>
+      <w:color w:val="BB6688"/>
+      <w:sz w:val="22"/>
     </w:rPr>
   </w:style>
   <w:style w:type="character" w:customStyle="1" w:styleId="ImportTok">
     <w:name w:val="ImportTok"/>
     <w:basedOn w:val="VerbatimChar"/>
     <w:rPr>
+      <w:rFonts w:ascii="Consolas" w:hAnsi="Consolas"/>
       <w:b/>
       <w:color w:val="008000"/>
+      <w:sz w:val="22"/>
     </w:rPr>
   </w:style>
   <w:style w:type="character" w:customStyle="1" w:styleId="CommentTok">
     <w:name w:val="CommentTok"/>
     <w:basedOn w:val="VerbatimChar"/>
     <w:rPr>
+      <w:rFonts w:ascii="Consolas" w:hAnsi="Consolas"/>
       <w:i/>
-      <w:color w:val="60a0b0"/>
+      <w:color w:val="60A0B0"/>
+      <w:sz w:val="22"/>
     </w:rPr>
   </w:style>
   <w:style w:type="character" w:customStyle="1" w:styleId="DocumentationTok">
     <w:name w:val="DocumentationTok"/>
     <w:basedOn w:val="VerbatimChar"/>
     <w:rPr>
+      <w:rFonts w:ascii="Consolas" w:hAnsi="Consolas"/>
       <w:i/>
-      <w:color w:val="ba2121"/>
+      <w:color w:val="BA2121"/>
+      <w:sz w:val="22"/>
     </w:rPr>
   </w:style>
   <w:style w:type="character" w:customStyle="1" w:styleId="AnnotationTok">
     <w:name w:val="AnnotationTok"/>
     <w:basedOn w:val="VerbatimChar"/>
     <w:rPr>
+      <w:rFonts w:ascii="Consolas" w:hAnsi="Consolas"/>
       <w:b/>
       <w:i/>
-      <w:color w:val="60a0b0"/>
+      <w:color w:val="60A0B0"/>
+      <w:sz w:val="22"/>
     </w:rPr>
   </w:style>
   <w:style w:type="character" w:customStyle="1" w:styleId="CommentVarTok">
     <w:name w:val="CommentVarTok"/>
     <w:basedOn w:val="VerbatimChar"/>
     <w:rPr>
+      <w:rFonts w:ascii="Consolas" w:hAnsi="Consolas"/>
       <w:b/>
       <w:i/>
-      <w:color w:val="60a0b0"/>
+      <w:color w:val="60A0B0"/>
+      <w:sz w:val="22"/>
     </w:rPr>
   </w:style>
   <w:style w:type="character" w:customStyle="1" w:styleId="OtherTok">
     <w:name w:val="OtherTok"/>
     <w:basedOn w:val="VerbatimChar"/>
     <w:rPr>
+      <w:rFonts w:ascii="Consolas" w:hAnsi="Consolas"/>
       <w:color w:val="007020"/>
+      <w:sz w:val="22"/>
     </w:rPr>
   </w:style>
   <w:style w:type="character" w:customStyle="1" w:styleId="FunctionTok">
     <w:name w:val="FunctionTok"/>
     <w:basedOn w:val="VerbatimChar"/>
     <w:rPr>
-      <w:color w:val="06287e"/>
+      <w:rFonts w:ascii="Consolas" w:hAnsi="Consolas"/>
+      <w:color w:val="06287E"/>
+      <w:sz w:val="22"/>
     </w:rPr>
   </w:style>
   <w:style w:type="character" w:customStyle="1" w:styleId="VariableTok">
     <w:name w:val="VariableTok"/>
     <w:basedOn w:val="VerbatimChar"/>
     <w:rPr>
-      <w:color w:val="19177c"/>
+      <w:rFonts w:ascii="Consolas" w:hAnsi="Consolas"/>
+      <w:color w:val="19177C"/>
+      <w:sz w:val="22"/>
     </w:rPr>
   </w:style>
   <w:style w:type="character" w:customStyle="1" w:styleId="ControlFlowTok">
     <w:name w:val="ControlFlowTok"/>
     <w:basedOn w:val="VerbatimChar"/>
     <w:rPr>
+      <w:rFonts w:ascii="Consolas" w:hAnsi="Consolas"/>
       <w:b/>
       <w:color w:val="007020"/>
+      <w:sz w:val="22"/>
     </w:rPr>
   </w:style>
   <w:style w:type="character" w:customStyle="1" w:styleId="OperatorTok">
     <w:name w:val="OperatorTok"/>
     <w:basedOn w:val="VerbatimChar"/>
     <w:rPr>
+      <w:rFonts w:ascii="Consolas" w:hAnsi="Consolas"/>
       <w:color w:val="666666"/>
+      <w:sz w:val="22"/>
     </w:rPr>
   </w:style>
   <w:style w:type="character" w:customStyle="1" w:styleId="BuiltInTok">
     <w:name w:val="BuiltInTok"/>
     <w:basedOn w:val="VerbatimChar"/>
     <w:rPr>
+      <w:rFonts w:ascii="Consolas" w:hAnsi="Consolas"/>
       <w:color w:val="008000"/>
+      <w:sz w:val="22"/>
     </w:rPr>
   </w:style>
   <w:style w:type="character" w:customStyle="1" w:styleId="ExtensionTok">
     <w:name w:val="ExtensionTok"/>
     <w:basedOn w:val="VerbatimChar"/>
-    <w:rPr/>
+    <w:rPr>
+      <w:rFonts w:ascii="Consolas" w:hAnsi="Consolas"/>
+      <w:sz w:val="22"/>
+    </w:rPr>
   </w:style>
   <w:style w:type="character" w:customStyle="1" w:styleId="PreprocessorTok">
     <w:name w:val="PreprocessorTok"/>
     <w:basedOn w:val="VerbatimChar"/>
     <w:rPr>
-      <w:color w:val="bc7a00"/>
+      <w:rFonts w:ascii="Consolas" w:hAnsi="Consolas"/>
+      <w:color w:val="BC7A00"/>
+      <w:sz w:val="22"/>
     </w:rPr>
   </w:style>
   <w:style w:type="character" w:customStyle="1" w:styleId="AttributeTok">
     <w:name w:val="AttributeTok"/>
     <w:basedOn w:val="VerbatimChar"/>
     <w:rPr>
-      <w:color w:val="7d9029"/>
+      <w:rFonts w:ascii="Consolas" w:hAnsi="Consolas"/>
+      <w:color w:val="7D9029"/>
+      <w:sz w:val="22"/>
     </w:rPr>
   </w:style>
   <w:style w:type="character" w:customStyle="1" w:styleId="RegionMarkerTok">
     <w:name w:val="RegionMarkerTok"/>
     <w:basedOn w:val="VerbatimChar"/>
-    <w:rPr/>
+    <w:rPr>
+      <w:rFonts w:ascii="Consolas" w:hAnsi="Consolas"/>
+      <w:sz w:val="22"/>
+    </w:rPr>
   </w:style>
   <w:style w:type="character" w:customStyle="1" w:styleId="InformationTok">
     <w:name w:val="InformationTok"/>
     <w:basedOn w:val="VerbatimChar"/>
     <w:rPr>
+      <w:rFonts w:ascii="Consolas" w:hAnsi="Consolas"/>
       <w:b/>
       <w:i/>
-      <w:color w:val="60a0b0"/>
+      <w:color w:val="60A0B0"/>
+      <w:sz w:val="22"/>
     </w:rPr>
   </w:style>
   <w:style w:type="character" w:customStyle="1" w:styleId="WarningTok">
     <w:name w:val="WarningTok"/>
     <w:basedOn w:val="VerbatimChar"/>
     <w:rPr>
+      <w:rFonts w:ascii="Consolas" w:hAnsi="Consolas"/>
       <w:b/>
       <w:i/>
-      <w:color w:val="60a0b0"/>
+      <w:color w:val="60A0B0"/>
+      <w:sz w:val="22"/>
     </w:rPr>
   </w:style>
   <w:style w:type="character" w:customStyle="1" w:styleId="AlertTok">
     <w:name w:val="AlertTok"/>
     <w:basedOn w:val="VerbatimChar"/>
     <w:rPr>
+      <w:rFonts w:ascii="Consolas" w:hAnsi="Consolas"/>
       <w:b/>
-      <w:color w:val="ff0000"/>
+      <w:color w:val="FF0000"/>
+      <w:sz w:val="22"/>
     </w:rPr>
   </w:style>
   <w:style w:type="character" w:customStyle="1" w:styleId="ErrorTok">
     <w:name w:val="ErrorTok"/>
     <w:basedOn w:val="VerbatimChar"/>
     <w:rPr>
+      <w:rFonts w:ascii="Consolas" w:hAnsi="Consolas"/>
       <w:b/>
-      <w:color w:val="ff0000"/>
+      <w:color w:val="FF0000"/>
+      <w:sz w:val="22"/>
     </w:rPr>
   </w:style>
   <w:style w:type="character" w:customStyle="1" w:styleId="NormalTok">
     <w:name w:val="NormalTok"/>
     <w:basedOn w:val="VerbatimChar"/>
-    <w:rPr/>
+    <w:rPr>
+      <w:rFonts w:ascii="Consolas" w:hAnsi="Consolas"/>
+      <w:sz w:val="22"/>
+    </w:rPr>
   </w:style>
 </w:styles>
 </file>

</xml_diff>

<commit_message>
Align APP98322 JeS pack with follow-on aims, IPA 16 Oct costs, and ATMCS travel.
Update summary and V&A pathway language, refresh Resources for PL-only Stockholm costing against the new RA salary lock, and add the SCAFC partner letter materials for submission.

Co-authored-by: Cursor <cursoragent@cursor.com>
</commit_message>
<xml_diff>
--- a/08_current/grant/live/01_Summary.docx
+++ b/08_current/grant/live/01_Summary.docx
@@ -2,13 +2,13 @@
 <file path=word/document.xml><?xml version="1.0" encoding="utf-8"?>
 <w:document xmlns:w="http://schemas.openxmlformats.org/wordprocessingml/2006/main" xmlns:m="http://schemas.openxmlformats.org/officeDocument/2006/math" xmlns:r="http://schemas.openxmlformats.org/officeDocument/2006/relationships" xmlns:o="urn:schemas-microsoft-com:office:office" xmlns:v="urn:schemas-microsoft-com:vml" xmlns:w10="urn:schemas-microsoft-com:office:word" xmlns:a="http://schemas.openxmlformats.org/drawingml/2006/main" xmlns:pic="http://schemas.openxmlformats.org/drawingml/2006/picture" xmlns:wp="http://schemas.openxmlformats.org/drawingml/2006/wordprocessingDrawing">
   <w:body>
-    <w:bookmarkStart w:id="13" w:name="summary-jes-public-summary-adervisorial"/>
+    <w:bookmarkStart w:id="13" w:name="summary-jes-public-summary"/>
     <w:p>
       <w:pPr>
         <w:pStyle w:val="Heading1"/>
       </w:pPr>
       <w:r>
-        <w:t xml:space="preserve">SUMMARY (JeS public summary) adervisorial</w:t>
+        <w:t xml:space="preserve">SUMMARY (JeS public summary)</w:t>
       </w:r>
     </w:p>
     <w:p>
@@ -26,7 +26,7 @@
         <w:t xml:space="preserve"> </w:t>
       </w:r>
       <w:r>
-        <w:t xml:space="preserve">Paste the four sections below, including the headings (540 body words + 10 heading words = 550). Do not paste this header block.</w:t>
+        <w:t xml:space="preserve">Paste the four sections below, including the headings. Do not paste this header block.</w:t>
       </w:r>
       <w:r>
         <w:t xml:space="preserve"> </w:t>
@@ -42,31 +42,7 @@
         <w:t xml:space="preserve"> </w:t>
       </w:r>
       <w:r>
-        <w:t xml:space="preserve">540 body / 550 with headings.</w:t>
-      </w:r>
-    </w:p>
-    <w:p>
-      <w:pPr>
-        <w:pStyle w:val="BodyText"/>
-      </w:pPr>
-      <w:r>
-        <w:rPr>
-          <w:b/>
-          <w:bCs/>
-        </w:rPr>
-        <w:t xml:space="preserve">Source:</w:t>
-      </w:r>
-      <w:r>
-        <w:t xml:space="preserve"> </w:t>
-      </w:r>
-      <w:r>
-        <w:rPr>
-          <w:rStyle w:val="VerbatimChar"/>
-        </w:rPr>
-        <w:t xml:space="preserve">../LaySummary.docx</w:t>
-      </w:r>
-      <w:r>
-        <w:t xml:space="preserve">. Plain English for expert assignment; this text is made publicly available.</w:t>
+        <w:t xml:space="preserve">550 words, including the four headings (16 Oct 2026 recount).</w:t>
       </w:r>
     </w:p>
     <w:bookmarkStart w:id="9" w:name="context"/>
@@ -143,7 +119,7 @@
         <w:pStyle w:val="FirstParagraph"/>
       </w:pPr>
       <w:r>
-        <w:t xml:space="preserve">The project builds the mathematical foundations for shape-based analysis of competitive collective systems. These are groups of agents that share a bounded domain, each coordinating internally while responding to an opponent. A ten-match pilot recovers distinct organisational levels that respond to real match events. This grant scales that work across a Championship season (540 matches).</w:t>
+        <w:t xml:space="preserve">The project builds the mathematical foundations for shape-based analysis of competitive collective systems. These are groups of agents that share a bounded domain, each coordinating internally while responding to an opponent. A ten-match pilot recovers distinct organisational levels that respond to real match events. This grant scales that work across a Championship season (about 540 matches).</w:t>
       </w:r>
     </w:p>
     <w:p>
@@ -177,7 +153,7 @@
         <w:pStyle w:val="FirstParagraph"/>
       </w:pPr>
       <w:r>
-        <w:t xml:space="preserve">This project will deliver football-validated theory and software: a scale-separated analysis that accounts for competitive dependence (successive observations are not independent). The primary output is a documented open-source package that computes multi-scale shape summaries from tracking data, released with a digital object identifier (DOI). Swansea City Association Football Club and StatsBomb co-develop the work. The club receives checkable structural measures of pressing, formation gaps and defensive-line organisation. StatsBomb receives features beyond conventional geometry.</w:t>
+        <w:t xml:space="preserve">This project will deliver football-validated theory and software: a scale-separated analysis that accounts for competitive dependence (successive observations are not independent). The primary output is a documented open-source package that computes multi-scale shape summaries from tracking data, released with a digital object identifier (DOI). Swansea City Association Football Club is the sole project partner. The club receives checkable structural measures of pressing, formation gaps and defensive-line organisation, developed on its tracking data.</w:t>
       </w:r>
     </w:p>
     <w:p>
@@ -185,7 +161,7 @@
         <w:pStyle w:val="BodyText"/>
       </w:pPr>
       <w:r>
-        <w:t xml:space="preserve">The same organisational problem, competing groups inside a bounded domain, appears in spatial predator–prey dynamics, including competition between tumour cells and immune cells. A second later target is competitive logistics with autonomous-fleet coordination. Neither is a deliverable of this award: transfer is a later step, once interaction lengths are re-derived. Full-season results and theory form an evidence pack for a follow-on Standard Grant, through mathematical-oncology collaborations specific to that programme.</w:t>
+        <w:t xml:space="preserve">Full-season results lay the foundation for a larger project. Replacing a group by its centre can invent or hide structure, as can a different grouping or a change in the distance used. The larger project asks when the shape is real, not an artefact of them. These questions are asked in a second setting, with its own distances, so the tools are not limited to one environment.</w:t>
       </w:r>
     </w:p>
     <w:bookmarkEnd w:id="12"/>

</xml_diff>